<commit_message>
add more details to resume
</commit_message>
<xml_diff>
--- a/resume/english.docx
+++ b/resume/english.docx
@@ -63,16 +63,8 @@
     </w:p>
     <w:p>
       <w:pPr>
-        <w:pStyle w:val="Balk1"/>
-        <w:spacing w:before="121"/>
-        <w:ind w:left="0"/>
-      </w:pPr>
-    </w:p>
-    <w:p>
-      <w:pPr>
         <w:spacing w:before="137" w:line="360" w:lineRule="auto"/>
         <w:ind w:left="142" w:right="306"/>
-        <w:jc w:val="right"/>
         <w:rPr>
           <w:b/>
           <w:spacing w:val="-2"/>
@@ -101,7 +93,6 @@
       <w:pPr>
         <w:spacing w:before="137" w:line="360" w:lineRule="auto"/>
         <w:ind w:left="142" w:right="306"/>
-        <w:jc w:val="right"/>
         <w:rPr>
           <w:b/>
           <w:spacing w:val="-2"/>
@@ -209,23 +200,661 @@
     <w:p>
       <w:pPr>
         <w:pStyle w:val="Balk1"/>
-        <w:ind w:left="0" w:firstLine="142"/>
+        <w:spacing w:before="112"/>
+        <w:rPr>
+          <w:color w:val="C00000"/>
+        </w:rPr>
+      </w:pPr>
+      <w:r>
         <w:rPr>
           <w:color w:val="C00000"/>
           <w:spacing w:val="-2"/>
         </w:rPr>
-      </w:pPr>
-      <w:r>
+        <w:t>FORMAL EDUCATION</w:t>
+      </w:r>
+    </w:p>
+    <w:p>
+      <w:pPr>
+        <w:pStyle w:val="Balk3"/>
+        <w:spacing w:before="254" w:line="276" w:lineRule="auto"/>
+        <w:ind w:left="142"/>
+        <w:rPr>
+          <w:b w:val="0"/>
+          <w:bCs w:val="0"/>
+          <w:spacing w:val="-10"/>
+          <w:sz w:val="16"/>
+          <w:szCs w:val="16"/>
+          <w:u w:val="none"/>
+        </w:rPr>
+      </w:pPr>
+      <w:r>
+        <w:rPr>
+          <w:u w:val="none"/>
+        </w:rPr>
+        <w:t xml:space="preserve">Koç </w:t>
+      </w:r>
+      <w:r>
+        <w:rPr>
+          <w:spacing w:val="-2"/>
+          <w:u w:val="none"/>
+        </w:rPr>
+        <w:t>University</w:t>
+      </w:r>
+      <w:r>
+        <w:rPr>
+          <w:b w:val="0"/>
+          <w:bCs w:val="0"/>
+          <w:spacing w:val="-2"/>
+          <w:u w:val="none"/>
+        </w:rPr>
+        <w:t xml:space="preserve"> </w:t>
+      </w:r>
+      <w:r>
+        <w:rPr>
+          <w:b w:val="0"/>
+          <w:bCs w:val="0"/>
+          <w:spacing w:val="-2"/>
+          <w:u w:val="none"/>
+        </w:rPr>
+        <w:t xml:space="preserve"> </w:t>
+      </w:r>
+      <w:r>
+        <w:rPr>
+          <w:b w:val="0"/>
+          <w:bCs w:val="0"/>
+          <w:spacing w:val="-2"/>
+          <w:u w:val="none"/>
+        </w:rPr>
+        <w:t xml:space="preserve"> </w:t>
+      </w:r>
+      <w:r>
+        <w:rPr>
+          <w:b w:val="0"/>
+          <w:bCs w:val="0"/>
+          <w:sz w:val="20"/>
+          <w:szCs w:val="20"/>
+          <w:u w:val="none"/>
+        </w:rPr>
+        <w:t>Istanbul,</w:t>
+      </w:r>
+      <w:r>
+        <w:rPr>
+          <w:b w:val="0"/>
+          <w:bCs w:val="0"/>
+          <w:spacing w:val="-10"/>
+          <w:sz w:val="20"/>
+          <w:szCs w:val="20"/>
+          <w:u w:val="none"/>
+        </w:rPr>
+        <w:t xml:space="preserve"> </w:t>
+      </w:r>
+      <w:r>
+        <w:rPr>
+          <w:b w:val="0"/>
+          <w:bCs w:val="0"/>
+          <w:sz w:val="20"/>
+          <w:szCs w:val="20"/>
+          <w:u w:val="none"/>
+        </w:rPr>
+        <w:t>Turkey</w:t>
+      </w:r>
+      <w:r>
+        <w:rPr>
+          <w:b w:val="0"/>
+          <w:bCs w:val="0"/>
+          <w:spacing w:val="-10"/>
+          <w:u w:val="none"/>
+        </w:rPr>
+        <w:br/>
+      </w:r>
+      <w:r>
+        <w:rPr>
+          <w:b w:val="0"/>
+          <w:bCs w:val="0"/>
+          <w:sz w:val="18"/>
+          <w:szCs w:val="18"/>
+          <w:u w:val="none"/>
+        </w:rPr>
+        <w:t>2013</w:t>
+      </w:r>
+      <w:r>
+        <w:rPr>
+          <w:b w:val="0"/>
+          <w:bCs w:val="0"/>
+          <w:spacing w:val="-10"/>
+          <w:sz w:val="18"/>
+          <w:szCs w:val="18"/>
+          <w:u w:val="none"/>
+        </w:rPr>
+        <w:t xml:space="preserve"> </w:t>
+      </w:r>
+      <w:r>
+        <w:rPr>
+          <w:b w:val="0"/>
+          <w:bCs w:val="0"/>
+          <w:sz w:val="18"/>
+          <w:szCs w:val="18"/>
+          <w:u w:val="none"/>
+        </w:rPr>
+        <w:t>(prep</w:t>
+      </w:r>
+      <w:r>
+        <w:rPr>
+          <w:b w:val="0"/>
+          <w:bCs w:val="0"/>
+          <w:spacing w:val="-10"/>
+          <w:sz w:val="18"/>
+          <w:szCs w:val="18"/>
+          <w:u w:val="none"/>
+        </w:rPr>
+        <w:t xml:space="preserve"> </w:t>
+      </w:r>
+      <w:r>
+        <w:rPr>
+          <w:b w:val="0"/>
+          <w:bCs w:val="0"/>
+          <w:sz w:val="18"/>
+          <w:szCs w:val="18"/>
+          <w:u w:val="none"/>
+        </w:rPr>
+        <w:t>+</w:t>
+      </w:r>
+      <w:r>
+        <w:rPr>
+          <w:b w:val="0"/>
+          <w:bCs w:val="0"/>
+          <w:spacing w:val="-10"/>
+          <w:sz w:val="18"/>
+          <w:szCs w:val="18"/>
+          <w:u w:val="none"/>
+        </w:rPr>
+        <w:t xml:space="preserve"> </w:t>
+      </w:r>
+      <w:r>
+        <w:rPr>
+          <w:b w:val="0"/>
+          <w:bCs w:val="0"/>
+          <w:sz w:val="18"/>
+          <w:szCs w:val="18"/>
+          <w:u w:val="none"/>
+        </w:rPr>
+        <w:t>4</w:t>
+      </w:r>
+      <w:r>
+        <w:rPr>
+          <w:b w:val="0"/>
+          <w:bCs w:val="0"/>
+          <w:spacing w:val="-10"/>
+          <w:sz w:val="18"/>
+          <w:szCs w:val="18"/>
+          <w:u w:val="none"/>
+        </w:rPr>
+        <w:t xml:space="preserve"> </w:t>
+      </w:r>
+      <w:r>
+        <w:rPr>
+          <w:b w:val="0"/>
+          <w:bCs w:val="0"/>
+          <w:sz w:val="18"/>
+          <w:szCs w:val="18"/>
+          <w:u w:val="none"/>
+        </w:rPr>
+        <w:t>years)</w:t>
+      </w:r>
+      <w:r>
+        <w:rPr>
+          <w:b w:val="0"/>
+          <w:bCs w:val="0"/>
+          <w:spacing w:val="-10"/>
+          <w:sz w:val="18"/>
+          <w:szCs w:val="18"/>
+          <w:u w:val="none"/>
+        </w:rPr>
+        <w:br/>
+      </w:r>
+      <w:r>
+        <w:rPr>
+          <w:b w:val="0"/>
+          <w:bCs w:val="0"/>
+          <w:sz w:val="18"/>
+          <w:szCs w:val="18"/>
+          <w:u w:val="none"/>
+        </w:rPr>
+        <w:t xml:space="preserve">Bachelor of Science </w:t>
+      </w:r>
+      <w:r>
+        <w:rPr>
+          <w:sz w:val="18"/>
+          <w:szCs w:val="18"/>
+          <w:u w:val="none"/>
+        </w:rPr>
+        <w:t>Computer Engineering</w:t>
+      </w:r>
+      <w:r>
+        <w:rPr>
+          <w:b w:val="0"/>
+          <w:bCs w:val="0"/>
+          <w:sz w:val="20"/>
+          <w:szCs w:val="20"/>
+          <w:u w:val="none"/>
+        </w:rPr>
+        <w:t xml:space="preserve">  </w:t>
+      </w:r>
+      <w:r>
+        <w:rPr>
+          <w:b w:val="0"/>
+          <w:bCs w:val="0"/>
+          <w:u w:val="none"/>
+        </w:rPr>
+        <w:br/>
+      </w:r>
+      <w:r>
+        <w:rPr>
+          <w:b w:val="0"/>
+          <w:bCs w:val="0"/>
+          <w:color w:val="5E5E5E"/>
+          <w:sz w:val="18"/>
+          <w:szCs w:val="18"/>
+          <w:u w:val="none"/>
+        </w:rPr>
+        <w:t>Clubs:</w:t>
+      </w:r>
+      <w:r>
+        <w:rPr>
+          <w:b w:val="0"/>
+          <w:bCs w:val="0"/>
+          <w:color w:val="5E5E5E"/>
+          <w:spacing w:val="-11"/>
+          <w:sz w:val="18"/>
+          <w:szCs w:val="18"/>
+          <w:u w:val="none"/>
+        </w:rPr>
+        <w:t xml:space="preserve"> </w:t>
+      </w:r>
+      <w:r>
+        <w:rPr>
+          <w:b w:val="0"/>
+          <w:bCs w:val="0"/>
+          <w:color w:val="5E5E5E"/>
+          <w:sz w:val="18"/>
+          <w:szCs w:val="18"/>
+          <w:u w:val="none"/>
+        </w:rPr>
+        <w:t>Computer,</w:t>
+      </w:r>
+      <w:r>
+        <w:rPr>
+          <w:b w:val="0"/>
+          <w:bCs w:val="0"/>
+          <w:color w:val="5E5E5E"/>
+          <w:spacing w:val="-11"/>
+          <w:sz w:val="18"/>
+          <w:szCs w:val="18"/>
+          <w:u w:val="none"/>
+        </w:rPr>
+        <w:t xml:space="preserve"> </w:t>
+      </w:r>
+      <w:r>
+        <w:rPr>
+          <w:b w:val="0"/>
+          <w:bCs w:val="0"/>
+          <w:color w:val="5E5E5E"/>
+          <w:sz w:val="18"/>
+          <w:szCs w:val="18"/>
+          <w:u w:val="none"/>
+        </w:rPr>
+        <w:t>Drama,</w:t>
+      </w:r>
+      <w:r>
+        <w:rPr>
+          <w:b w:val="0"/>
+          <w:bCs w:val="0"/>
+          <w:color w:val="5E5E5E"/>
+          <w:spacing w:val="-11"/>
+          <w:sz w:val="18"/>
+          <w:szCs w:val="18"/>
+          <w:u w:val="none"/>
+        </w:rPr>
+        <w:t xml:space="preserve"> </w:t>
+      </w:r>
+      <w:r>
+        <w:rPr>
+          <w:b w:val="0"/>
+          <w:bCs w:val="0"/>
+          <w:color w:val="5E5E5E"/>
+          <w:sz w:val="18"/>
+          <w:szCs w:val="18"/>
+          <w:u w:val="none"/>
+        </w:rPr>
+        <w:t>Management Memberships: ACM Student Chapter</w:t>
+      </w:r>
+    </w:p>
+    <w:p>
+      <w:pPr>
+        <w:jc w:val="both"/>
+      </w:pPr>
+    </w:p>
+    <w:p>
+      <w:pPr>
+        <w:spacing w:line="276" w:lineRule="auto"/>
+        <w:ind w:left="142"/>
+        <w:rPr>
+          <w:b/>
+          <w:bCs/>
+        </w:rPr>
+      </w:pPr>
+      <w:r>
+        <w:rPr>
+          <w:b/>
+          <w:bCs/>
+        </w:rPr>
+        <w:t>BEM</w:t>
+      </w:r>
+      <w:r>
+        <w:rPr>
+          <w:b/>
+          <w:bCs/>
+          <w:spacing w:val="9"/>
+        </w:rPr>
+        <w:t xml:space="preserve"> </w:t>
+      </w:r>
+      <w:r>
+        <w:rPr>
+          <w:b/>
+          <w:bCs/>
+        </w:rPr>
+        <w:t>-</w:t>
+      </w:r>
+      <w:r>
+        <w:rPr>
+          <w:b/>
+          <w:bCs/>
+          <w:spacing w:val="9"/>
+        </w:rPr>
+        <w:t xml:space="preserve"> </w:t>
+      </w:r>
+      <w:r>
+        <w:rPr>
+          <w:b/>
+          <w:bCs/>
+        </w:rPr>
+        <w:t>Bordeaux</w:t>
+      </w:r>
+      <w:r>
+        <w:rPr>
+          <w:b/>
+          <w:bCs/>
+          <w:spacing w:val="9"/>
+        </w:rPr>
+        <w:t xml:space="preserve"> </w:t>
+      </w:r>
+      <w:r>
+        <w:rPr>
+          <w:b/>
+          <w:bCs/>
+        </w:rPr>
+        <w:t>Management</w:t>
+      </w:r>
+      <w:r>
+        <w:rPr>
+          <w:b/>
+          <w:bCs/>
+          <w:spacing w:val="9"/>
+        </w:rPr>
+        <w:t xml:space="preserve"> </w:t>
+      </w:r>
+      <w:r>
+        <w:rPr>
+          <w:b/>
+          <w:bCs/>
+          <w:spacing w:val="-2"/>
+        </w:rPr>
+        <w:t>School</w:t>
+      </w:r>
+      <w:r>
+        <w:rPr>
+          <w:b/>
+          <w:bCs/>
+          <w:spacing w:val="-2"/>
+        </w:rPr>
+        <w:t xml:space="preserve"> </w:t>
+      </w:r>
+      <w:r>
+        <w:rPr>
+          <w:b/>
+          <w:bCs/>
+          <w:spacing w:val="-2"/>
+        </w:rPr>
+        <w:tab/>
+      </w:r>
+      <w:r>
+        <w:rPr>
+          <w:sz w:val="20"/>
+          <w:szCs w:val="20"/>
+        </w:rPr>
+        <w:t>Bordeaux,</w:t>
+      </w:r>
+      <w:r>
+        <w:rPr>
+          <w:spacing w:val="-10"/>
+          <w:sz w:val="20"/>
+          <w:szCs w:val="20"/>
+        </w:rPr>
+        <w:t xml:space="preserve"> </w:t>
+      </w:r>
+      <w:r>
+        <w:rPr>
+          <w:sz w:val="20"/>
+          <w:szCs w:val="20"/>
+        </w:rPr>
+        <w:t>France</w:t>
+      </w:r>
+      <w:r>
+        <w:rPr>
+          <w:spacing w:val="-10"/>
+        </w:rPr>
+        <w:br/>
+      </w:r>
+      <w:r>
+        <w:rPr>
+          <w:sz w:val="18"/>
+          <w:szCs w:val="18"/>
+        </w:rPr>
+        <w:t>2013</w:t>
+      </w:r>
+      <w:r>
+        <w:rPr>
+          <w:spacing w:val="-10"/>
+          <w:sz w:val="18"/>
+          <w:szCs w:val="18"/>
+        </w:rPr>
+        <w:t xml:space="preserve"> </w:t>
+      </w:r>
+      <w:r>
+        <w:rPr>
+          <w:sz w:val="18"/>
+          <w:szCs w:val="18"/>
+        </w:rPr>
+        <w:t>(5</w:t>
+      </w:r>
+      <w:r>
+        <w:rPr>
+          <w:spacing w:val="-10"/>
+          <w:sz w:val="18"/>
+          <w:szCs w:val="18"/>
+        </w:rPr>
+        <w:t xml:space="preserve"> </w:t>
+      </w:r>
+      <w:r>
+        <w:rPr>
+          <w:sz w:val="18"/>
+          <w:szCs w:val="18"/>
+        </w:rPr>
+        <w:t>months)</w:t>
+      </w:r>
+      <w:r>
+        <w:rPr>
+          <w:sz w:val="18"/>
+          <w:szCs w:val="18"/>
+        </w:rPr>
+        <w:br/>
+      </w:r>
+      <w:r>
+        <w:rPr>
+          <w:sz w:val="18"/>
+          <w:szCs w:val="18"/>
+        </w:rPr>
+        <w:t>Exchange Student</w:t>
+      </w:r>
+      <w:r>
+        <w:rPr>
+          <w:sz w:val="18"/>
+          <w:szCs w:val="18"/>
+        </w:rPr>
+        <w:t xml:space="preserve"> in </w:t>
+      </w:r>
+      <w:r>
+        <w:rPr>
+          <w:b/>
+          <w:bCs/>
+          <w:sz w:val="18"/>
+          <w:szCs w:val="18"/>
+        </w:rPr>
+        <w:t>Business</w:t>
+      </w:r>
+      <w:r>
+        <w:rPr>
+          <w:b/>
+          <w:bCs/>
+          <w:spacing w:val="-3"/>
+          <w:sz w:val="18"/>
+          <w:szCs w:val="18"/>
+        </w:rPr>
+        <w:t xml:space="preserve"> </w:t>
+      </w:r>
+      <w:r>
+        <w:rPr>
+          <w:b/>
+          <w:bCs/>
+          <w:sz w:val="18"/>
+          <w:szCs w:val="18"/>
+        </w:rPr>
+        <w:t>&amp;</w:t>
+      </w:r>
+      <w:r>
+        <w:rPr>
+          <w:b/>
+          <w:bCs/>
+          <w:spacing w:val="-2"/>
+          <w:sz w:val="18"/>
+          <w:szCs w:val="18"/>
+        </w:rPr>
+        <w:t xml:space="preserve"> </w:t>
+      </w:r>
+      <w:r>
+        <w:rPr>
+          <w:b/>
+          <w:bCs/>
+          <w:sz w:val="18"/>
+          <w:szCs w:val="18"/>
+        </w:rPr>
+        <w:t>Marketing</w:t>
+      </w:r>
+    </w:p>
+    <w:p>
+      <w:pPr>
+        <w:pStyle w:val="GvdeMetni"/>
+        <w:spacing w:before="61"/>
+        <w:ind w:left="142" w:right="699"/>
+      </w:pPr>
+      <w:r>
+        <w:rPr>
+          <w:color w:val="5E5E5E"/>
+        </w:rPr>
+        <w:t>Main</w:t>
+      </w:r>
+      <w:r>
+        <w:rPr>
+          <w:color w:val="5E5E5E"/>
+          <w:spacing w:val="-6"/>
+        </w:rPr>
+        <w:t xml:space="preserve"> </w:t>
+      </w:r>
+      <w:r>
+        <w:rPr>
+          <w:color w:val="5E5E5E"/>
+        </w:rPr>
+        <w:t>Topics:</w:t>
+      </w:r>
+      <w:r>
+        <w:rPr>
+          <w:color w:val="5E5E5E"/>
+          <w:spacing w:val="-6"/>
+        </w:rPr>
+        <w:t xml:space="preserve"> </w:t>
+      </w:r>
+      <w:r>
+        <w:rPr>
+          <w:color w:val="5E5E5E"/>
+        </w:rPr>
+        <w:t>International</w:t>
+      </w:r>
+      <w:r>
+        <w:rPr>
+          <w:color w:val="5E5E5E"/>
+          <w:spacing w:val="-6"/>
+        </w:rPr>
+        <w:t xml:space="preserve"> </w:t>
+      </w:r>
+      <w:r>
+        <w:rPr>
+          <w:color w:val="5E5E5E"/>
+        </w:rPr>
+        <w:t>Project</w:t>
+      </w:r>
+      <w:r>
+        <w:rPr>
+          <w:color w:val="5E5E5E"/>
+          <w:spacing w:val="-6"/>
+        </w:rPr>
+        <w:t xml:space="preserve"> </w:t>
+      </w:r>
+      <w:r>
+        <w:rPr>
+          <w:color w:val="5E5E5E"/>
+        </w:rPr>
+        <w:t>Development, Human Resources, Marketing</w:t>
+      </w:r>
+    </w:p>
+    <w:p>
+      <w:pPr>
+        <w:pStyle w:val="Balk1"/>
+        <w:ind w:left="0"/>
         <w:rPr>
           <w:color w:val="C00000"/>
         </w:rPr>
-        <w:t xml:space="preserve">WORK </w:t>
-      </w:r>
-      <w:r>
+      </w:pPr>
+    </w:p>
+    <w:p>
+      <w:pPr>
+        <w:pStyle w:val="Balk1"/>
+        <w:ind w:left="0" w:firstLine="142"/>
         <w:rPr>
           <w:color w:val="C00000"/>
           <w:spacing w:val="-2"/>
         </w:rPr>
+      </w:pPr>
+      <w:r>
+        <w:rPr>
+          <w:color w:val="C00000"/>
+        </w:rPr>
+        <w:t xml:space="preserve">WORK </w:t>
+      </w:r>
+      <w:r>
+        <w:rPr>
+          <w:color w:val="C00000"/>
+          <w:spacing w:val="-2"/>
+        </w:rPr>
         <w:t>EXPERIENCE</w:t>
       </w:r>
     </w:p>
@@ -235,68 +864,7 @@
         <w:ind w:left="142"/>
         <w:rPr>
           <w:b/>
-          <w:color w:val="595959" w:themeColor="text1" w:themeTint="A6"/>
           <w:sz w:val="37"/>
-        </w:rPr>
-      </w:pPr>
-      <w:r>
-        <w:rPr>
-          <w:b/>
-          <w:sz w:val="37"/>
-        </w:rPr>
-        <w:t>Software Engineer</w:t>
-      </w:r>
-      <w:r>
-        <w:rPr>
-          <w:b/>
-          <w:sz w:val="37"/>
-        </w:rPr>
-        <w:t xml:space="preserve"> </w:t>
-      </w:r>
-      <w:r>
-        <w:rPr>
-          <w:b/>
-          <w:color w:val="595959" w:themeColor="text1" w:themeTint="A6"/>
-          <w:sz w:val="37"/>
-        </w:rPr>
-        <w:t>|</w:t>
-      </w:r>
-      <w:r>
-        <w:rPr>
-          <w:b/>
-          <w:color w:val="595959" w:themeColor="text1" w:themeTint="A6"/>
-          <w:sz w:val="37"/>
-        </w:rPr>
-        <w:t xml:space="preserve"> </w:t>
-      </w:r>
-      <w:r>
-        <w:rPr>
-          <w:b/>
-          <w:color w:val="595959" w:themeColor="text1" w:themeTint="A6"/>
-          <w:sz w:val="37"/>
-        </w:rPr>
-        <w:t>Product</w:t>
-      </w:r>
-      <w:r>
-        <w:rPr>
-          <w:b/>
-          <w:color w:val="595959" w:themeColor="text1" w:themeTint="A6"/>
-          <w:sz w:val="37"/>
-        </w:rPr>
-        <w:t xml:space="preserve"> &amp; Tech Management</w:t>
-      </w:r>
-    </w:p>
-    <w:p>
-      <w:pPr>
-        <w:rPr>
-          <w:sz w:val="20"/>
-        </w:rPr>
-      </w:pPr>
-    </w:p>
-    <w:p>
-      <w:pPr>
-        <w:rPr>
-          <w:sz w:val="20"/>
         </w:rPr>
         <w:sectPr>
           <w:type w:val="continuous"/>
@@ -305,6 +873,27 @@
           <w:cols w:space="708"/>
         </w:sectPr>
       </w:pPr>
+      <w:r>
+        <w:rPr>
+          <w:b/>
+          <w:sz w:val="37"/>
+        </w:rPr>
+        <w:t>P</w:t>
+      </w:r>
+      <w:r>
+        <w:rPr>
+          <w:b/>
+          <w:sz w:val="37"/>
+        </w:rPr>
+        <w:t>roduct</w:t>
+      </w:r>
+      <w:r>
+        <w:rPr>
+          <w:b/>
+          <w:sz w:val="37"/>
+        </w:rPr>
+        <w:t xml:space="preserve"> &amp; Tech Management</w:t>
+      </w:r>
     </w:p>
     <w:p>
       <w:pPr>
@@ -397,84 +986,59 @@
         </w:rPr>
         <w:t xml:space="preserve"> </w:t>
       </w:r>
-    </w:p>
-    <w:p>
-      <w:pPr>
-        <w:tabs>
-          <w:tab w:val="left" w:pos="426"/>
-        </w:tabs>
-        <w:spacing w:before="54" w:line="276" w:lineRule="auto"/>
-        <w:ind w:left="142"/>
-        <w:rPr>
-          <w:sz w:val="18"/>
-        </w:rPr>
-      </w:pPr>
-      <w:r>
-        <w:rPr>
-          <w:sz w:val="18"/>
-        </w:rPr>
-        <w:t>04.2021</w:t>
-      </w:r>
-      <w:r>
-        <w:rPr>
-          <w:spacing w:val="-1"/>
-          <w:sz w:val="18"/>
-        </w:rPr>
-        <w:t xml:space="preserve"> </w:t>
-      </w:r>
-      <w:r>
-        <w:rPr>
-          <w:sz w:val="18"/>
-        </w:rPr>
-        <w:t>-</w:t>
-      </w:r>
-      <w:r>
-        <w:rPr>
-          <w:spacing w:val="-1"/>
-          <w:sz w:val="18"/>
-        </w:rPr>
-        <w:t xml:space="preserve"> </w:t>
-      </w:r>
-      <w:r>
-        <w:rPr>
-          <w:sz w:val="18"/>
-        </w:rPr>
-        <w:t>04.</w:t>
-      </w:r>
-      <w:r>
-        <w:rPr>
-          <w:b/>
-          <w:sz w:val="18"/>
-        </w:rPr>
-        <w:t>2023</w:t>
-      </w:r>
-      <w:r>
-        <w:rPr>
-          <w:b/>
-          <w:spacing w:val="-2"/>
-          <w:sz w:val="18"/>
-        </w:rPr>
-        <w:t xml:space="preserve"> </w:t>
-      </w:r>
-      <w:r>
-        <w:rPr>
-          <w:sz w:val="18"/>
-        </w:rPr>
-        <w:t>(2</w:t>
-      </w:r>
-      <w:r>
-        <w:rPr>
-          <w:spacing w:val="-1"/>
-          <w:sz w:val="18"/>
-        </w:rPr>
-        <w:t xml:space="preserve"> </w:t>
-      </w:r>
-      <w:r>
-        <w:rPr>
-          <w:spacing w:val="-2"/>
-          <w:sz w:val="18"/>
-        </w:rPr>
-        <w:t>years)</w:t>
+      <w:r>
+        <w:rPr>
+          <w:b w:val="0"/>
+          <w:bCs w:val="0"/>
+          <w:sz w:val="20"/>
+          <w:u w:val="none"/>
+        </w:rPr>
+        <w:tab/>
+      </w:r>
+      <w:r>
+        <w:rPr>
+          <w:b w:val="0"/>
+          <w:bCs w:val="0"/>
+          <w:sz w:val="20"/>
+          <w:u w:val="none"/>
+        </w:rPr>
+        <w:tab/>
+      </w:r>
+      <w:r>
+        <w:rPr>
+          <w:b w:val="0"/>
+          <w:bCs w:val="0"/>
+          <w:sz w:val="20"/>
+          <w:u w:val="none"/>
+        </w:rPr>
+        <w:tab/>
+      </w:r>
+      <w:r>
+        <w:rPr>
+          <w:b w:val="0"/>
+          <w:bCs w:val="0"/>
+          <w:sz w:val="20"/>
+          <w:u w:val="none"/>
+        </w:rPr>
+        <w:tab/>
+      </w:r>
+      <w:r>
+        <w:rPr>
+          <w:b w:val="0"/>
+          <w:bCs w:val="0"/>
+          <w:sz w:val="20"/>
+          <w:u w:val="none"/>
+        </w:rPr>
+        <w:tab/>
+      </w:r>
+      <w:r>
+        <w:rPr>
+          <w:b w:val="0"/>
+          <w:bCs w:val="0"/>
+          <w:sz w:val="20"/>
+          <w:u w:val="none"/>
+        </w:rPr>
+        <w:tab/>
       </w:r>
     </w:p>
     <w:p>
@@ -494,63 +1058,234 @@
       </w:pPr>
       <w:r>
         <w:rPr>
-          <w:b/>
-          <w:bCs/>
+          <w:i/>
+          <w:sz w:val="18"/>
+        </w:rPr>
+        <w:t>Car</w:t>
+      </w:r>
+      <w:r>
+        <w:rPr>
+          <w:i/>
+          <w:spacing w:val="5"/>
+          <w:sz w:val="18"/>
+        </w:rPr>
+        <w:t xml:space="preserve"> </w:t>
+      </w:r>
+      <w:r>
+        <w:rPr>
+          <w:i/>
+          <w:sz w:val="18"/>
+        </w:rPr>
+        <w:t>Subscription</w:t>
+      </w:r>
+      <w:r>
+        <w:rPr>
+          <w:i/>
+          <w:spacing w:val="6"/>
+          <w:sz w:val="18"/>
+        </w:rPr>
+        <w:t xml:space="preserve"> </w:t>
+      </w:r>
+      <w:r>
+        <w:rPr>
+          <w:i/>
+          <w:spacing w:val="-2"/>
+          <w:sz w:val="18"/>
+        </w:rPr>
+        <w:t>Platform</w:t>
+      </w:r>
+    </w:p>
+    <w:p>
+      <w:pPr>
+        <w:pStyle w:val="Balk3"/>
+        <w:tabs>
+          <w:tab w:val="left" w:pos="426"/>
+        </w:tabs>
+        <w:spacing w:line="276" w:lineRule="auto"/>
+        <w:ind w:left="142"/>
+        <w:rPr>
+          <w:b w:val="0"/>
+          <w:bCs w:val="0"/>
+          <w:u w:val="none"/>
+        </w:rPr>
+      </w:pPr>
+      <w:r>
+        <w:rPr>
+          <w:b w:val="0"/>
+          <w:bCs w:val="0"/>
+          <w:sz w:val="18"/>
+          <w:u w:val="none"/>
+        </w:rPr>
+        <w:t>04.2021</w:t>
+      </w:r>
+      <w:r>
+        <w:rPr>
+          <w:b w:val="0"/>
+          <w:bCs w:val="0"/>
+          <w:spacing w:val="-1"/>
+          <w:sz w:val="18"/>
+          <w:u w:val="none"/>
+        </w:rPr>
+        <w:t xml:space="preserve"> </w:t>
+      </w:r>
+      <w:r>
+        <w:rPr>
+          <w:b w:val="0"/>
+          <w:bCs w:val="0"/>
+          <w:sz w:val="18"/>
+          <w:u w:val="none"/>
+        </w:rPr>
+        <w:t>-</w:t>
+      </w:r>
+      <w:r>
+        <w:rPr>
+          <w:b w:val="0"/>
+          <w:bCs w:val="0"/>
+          <w:spacing w:val="-1"/>
+          <w:sz w:val="18"/>
+          <w:u w:val="none"/>
+        </w:rPr>
+        <w:t xml:space="preserve"> </w:t>
+      </w:r>
+      <w:r>
+        <w:rPr>
+          <w:b w:val="0"/>
+          <w:bCs w:val="0"/>
+          <w:sz w:val="18"/>
+          <w:u w:val="none"/>
+        </w:rPr>
+        <w:t>04.</w:t>
+      </w:r>
+      <w:r>
+        <w:rPr>
+          <w:sz w:val="18"/>
+          <w:u w:val="none"/>
+        </w:rPr>
+        <w:t>2023</w:t>
+      </w:r>
+      <w:r>
+        <w:rPr>
+          <w:b w:val="0"/>
+          <w:bCs w:val="0"/>
+          <w:spacing w:val="-2"/>
+          <w:sz w:val="18"/>
+          <w:u w:val="none"/>
+        </w:rPr>
+        <w:t xml:space="preserve"> </w:t>
+      </w:r>
+      <w:r>
+        <w:rPr>
+          <w:b w:val="0"/>
+          <w:bCs w:val="0"/>
+          <w:sz w:val="18"/>
+          <w:u w:val="none"/>
+        </w:rPr>
+        <w:t>(2</w:t>
+      </w:r>
+      <w:r>
+        <w:rPr>
+          <w:b w:val="0"/>
+          <w:bCs w:val="0"/>
+          <w:spacing w:val="-1"/>
+          <w:sz w:val="18"/>
+          <w:u w:val="none"/>
+        </w:rPr>
+        <w:t xml:space="preserve"> </w:t>
+      </w:r>
+      <w:r>
+        <w:rPr>
+          <w:b w:val="0"/>
+          <w:bCs w:val="0"/>
+          <w:spacing w:val="-2"/>
+          <w:sz w:val="18"/>
+          <w:u w:val="none"/>
+        </w:rPr>
+        <w:t>years)</w:t>
+      </w:r>
+      <w:r>
+        <w:rPr>
+          <w:b w:val="0"/>
+          <w:bCs w:val="0"/>
           <w:iCs/>
           <w:spacing w:val="-2"/>
           <w:sz w:val="18"/>
         </w:rPr>
-        <w:t>Senior Software Enginee</w:t>
-      </w:r>
-      <w:r>
-        <w:rPr>
-          <w:b/>
-          <w:bCs/>
+        <w:br/>
+      </w:r>
+      <w:r>
+        <w:rPr>
           <w:iCs/>
           <w:spacing w:val="-2"/>
           <w:sz w:val="18"/>
-        </w:rPr>
-        <w:t>r I</w:t>
-      </w:r>
-      <w:r>
-        <w:rPr>
-          <w:b/>
-          <w:bCs/>
+          <w:u w:val="none"/>
+        </w:rPr>
+        <w:t>Senior Software Enginee</w:t>
+      </w:r>
+      <w:r>
+        <w:rPr>
+          <w:b w:val="0"/>
+          <w:bCs w:val="0"/>
           <w:iCs/>
           <w:spacing w:val="-2"/>
           <w:sz w:val="18"/>
+          <w:u w:val="none"/>
+        </w:rPr>
+        <w:t>r I</w:t>
+      </w:r>
+      <w:r>
+        <w:rPr>
+          <w:b w:val="0"/>
+          <w:bCs w:val="0"/>
+          <w:iCs/>
+          <w:spacing w:val="-2"/>
+          <w:sz w:val="18"/>
+          <w:u w:val="none"/>
         </w:rPr>
         <w:t xml:space="preserve">I </w:t>
       </w:r>
       <w:r>
         <w:rPr>
-          <w:b/>
-          <w:bCs/>
+          <w:b w:val="0"/>
+          <w:bCs w:val="0"/>
           <w:i/>
           <w:spacing w:val="-2"/>
           <w:sz w:val="18"/>
+          <w:u w:val="none"/>
         </w:rPr>
         <w:t>at</w:t>
       </w:r>
       <w:r>
         <w:rPr>
-          <w:b/>
-          <w:bCs/>
+          <w:b w:val="0"/>
+          <w:bCs w:val="0"/>
           <w:iCs/>
           <w:spacing w:val="-2"/>
           <w:sz w:val="18"/>
-        </w:rPr>
-        <w:t xml:space="preserve"> </w:t>
-      </w:r>
-      <w:r>
-        <w:rPr>
-          <w:b/>
-          <w:bCs/>
+          <w:u w:val="none"/>
+        </w:rPr>
+        <w:t xml:space="preserve"> </w:t>
+      </w:r>
+      <w:r>
+        <w:rPr>
+          <w:b w:val="0"/>
+          <w:bCs w:val="0"/>
           <w:i/>
           <w:spacing w:val="-2"/>
           <w:sz w:val="18"/>
+          <w:u w:val="none"/>
         </w:rPr>
         <w:t>User Acquisition department</w:t>
+      </w:r>
+      <w:r>
+        <w:rPr>
+          <w:b w:val="0"/>
+          <w:bCs w:val="0"/>
+          <w:i/>
+          <w:spacing w:val="-2"/>
+          <w:sz w:val="18"/>
+          <w:u w:val="none"/>
+        </w:rPr>
+        <w:t xml:space="preserve"> </w:t>
       </w:r>
     </w:p>
     <w:p>
@@ -566,90 +1301,181 @@
           <w:sz w:val="18"/>
         </w:rPr>
       </w:pPr>
-      <w:r>
-        <w:rPr>
-          <w:i/>
-          <w:sz w:val="18"/>
-        </w:rPr>
-        <w:t>Car</w:t>
-      </w:r>
-      <w:r>
-        <w:rPr>
-          <w:i/>
-          <w:spacing w:val="5"/>
-          <w:sz w:val="18"/>
-        </w:rPr>
-        <w:t xml:space="preserve"> </w:t>
-      </w:r>
-      <w:r>
-        <w:rPr>
-          <w:i/>
-          <w:sz w:val="18"/>
-        </w:rPr>
-        <w:t>Subscription</w:t>
-      </w:r>
-      <w:r>
-        <w:rPr>
-          <w:i/>
-          <w:spacing w:val="6"/>
-          <w:sz w:val="18"/>
-        </w:rPr>
-        <w:t xml:space="preserve"> </w:t>
-      </w:r>
-      <w:r>
-        <w:rPr>
-          <w:i/>
-          <w:spacing w:val="-2"/>
-          <w:sz w:val="18"/>
-        </w:rPr>
-        <w:t>Platform</w:t>
-      </w:r>
     </w:p>
     <w:p>
       <w:pPr>
         <w:tabs>
           <w:tab w:val="left" w:pos="426"/>
         </w:tabs>
-        <w:spacing w:before="60"/>
+        <w:spacing w:line="360" w:lineRule="auto"/>
         <w:ind w:left="142"/>
         <w:rPr>
-          <w:i/>
-          <w:spacing w:val="-2"/>
-          <w:sz w:val="18"/>
-        </w:rPr>
-      </w:pPr>
+          <w:b/>
+          <w:bCs/>
+          <w:sz w:val="18"/>
+          <w:szCs w:val="18"/>
+        </w:rPr>
+      </w:pPr>
+      <w:r>
+        <w:rPr>
+          <w:b/>
+          <w:bCs/>
+          <w:sz w:val="18"/>
+          <w:szCs w:val="18"/>
+        </w:rPr>
+        <w:t>Product Management</w:t>
+      </w:r>
     </w:p>
     <w:p>
       <w:pPr>
         <w:tabs>
           <w:tab w:val="left" w:pos="426"/>
         </w:tabs>
-        <w:spacing w:line="276" w:lineRule="auto"/>
+        <w:spacing w:line="360" w:lineRule="auto"/>
         <w:ind w:left="142"/>
         <w:rPr>
           <w:b/>
           <w:bCs/>
           <w:sz w:val="18"/>
           <w:szCs w:val="18"/>
-        </w:rPr>
-      </w:pPr>
+          <w:lang w:val="tr-TR"/>
+        </w:rPr>
+      </w:pPr>
+      <w:r>
+        <w:rPr>
+          <w:sz w:val="18"/>
+          <w:szCs w:val="18"/>
+        </w:rPr>
+        <w:t xml:space="preserve">With </w:t>
+      </w:r>
+      <w:r>
+        <w:rPr>
+          <w:sz w:val="18"/>
+          <w:szCs w:val="18"/>
+        </w:rPr>
+        <w:t>a</w:t>
+      </w:r>
+      <w:r>
+        <w:rPr>
+          <w:sz w:val="18"/>
+          <w:szCs w:val="18"/>
+        </w:rPr>
+        <w:t xml:space="preserve"> solid</w:t>
+      </w:r>
+      <w:r>
+        <w:rPr>
+          <w:sz w:val="18"/>
+          <w:szCs w:val="18"/>
+        </w:rPr>
+        <w:t xml:space="preserve"> experience </w:t>
+      </w:r>
+      <w:r>
+        <w:rPr>
+          <w:sz w:val="18"/>
+          <w:szCs w:val="18"/>
+        </w:rPr>
+        <w:t>in</w:t>
+      </w:r>
+      <w:r>
+        <w:rPr>
+          <w:sz w:val="18"/>
+          <w:szCs w:val="18"/>
+        </w:rPr>
+        <w:t xml:space="preserve"> </w:t>
+      </w:r>
+      <w:r>
+        <w:rPr>
+          <w:sz w:val="18"/>
+          <w:szCs w:val="18"/>
+        </w:rPr>
+        <w:t xml:space="preserve">stakeholder </w:t>
+      </w:r>
+      <w:r>
+        <w:rPr>
+          <w:sz w:val="18"/>
+          <w:szCs w:val="18"/>
+        </w:rPr>
+        <w:t>management</w:t>
+      </w:r>
+      <w:r>
+        <w:rPr>
+          <w:sz w:val="18"/>
+          <w:szCs w:val="18"/>
+        </w:rPr>
+        <w:t xml:space="preserve"> and</w:t>
+      </w:r>
+      <w:r>
+        <w:rPr>
+          <w:sz w:val="18"/>
+          <w:szCs w:val="18"/>
+        </w:rPr>
+        <w:t xml:space="preserve"> </w:t>
+      </w:r>
+      <w:r>
+        <w:rPr>
+          <w:sz w:val="18"/>
+          <w:szCs w:val="18"/>
+        </w:rPr>
+        <w:t>defining</w:t>
+      </w:r>
+      <w:r>
+        <w:rPr>
+          <w:sz w:val="18"/>
+          <w:szCs w:val="18"/>
+        </w:rPr>
+        <w:t xml:space="preserve"> Epics </w:t>
+      </w:r>
+      <w:r>
+        <w:rPr>
+          <w:sz w:val="18"/>
+          <w:szCs w:val="18"/>
+        </w:rPr>
+        <w:t xml:space="preserve">&amp; </w:t>
+      </w:r>
+      <w:r>
+        <w:rPr>
+          <w:sz w:val="18"/>
+          <w:szCs w:val="18"/>
+        </w:rPr>
+        <w:t>Stories in JIRA</w:t>
+      </w:r>
+      <w:r>
+        <w:rPr>
+          <w:sz w:val="18"/>
+          <w:szCs w:val="18"/>
+        </w:rPr>
+        <w:t xml:space="preserve"> </w:t>
+      </w:r>
       <w:r>
         <w:rPr>
           <w:b/>
           <w:bCs/>
           <w:sz w:val="18"/>
           <w:szCs w:val="18"/>
-        </w:rPr>
-        <w:t>Product Management</w:t>
-      </w:r>
-      <w:r>
-        <w:rPr>
-          <w:b/>
-          <w:bCs/>
-          <w:sz w:val="18"/>
-          <w:szCs w:val="18"/>
-        </w:rPr>
-        <w:t xml:space="preserve"> highlights</w:t>
+          <w:lang w:val="tr-TR"/>
+        </w:rPr>
+        <w:t>—</w:t>
+      </w:r>
+      <w:r>
+        <w:rPr>
+          <w:sz w:val="18"/>
+          <w:szCs w:val="18"/>
+        </w:rPr>
+        <w:t xml:space="preserve"> together with</w:t>
+      </w:r>
+      <w:r>
+        <w:rPr>
+          <w:sz w:val="18"/>
+          <w:szCs w:val="18"/>
+        </w:rPr>
+        <w:t xml:space="preserve"> sprint and </w:t>
+      </w:r>
+      <w:r>
+        <w:rPr>
+          <w:sz w:val="18"/>
+          <w:szCs w:val="18"/>
+        </w:rPr>
+        <w:t>backlog management</w:t>
       </w:r>
     </w:p>
     <w:p>
@@ -672,7 +1498,7 @@
         <w:rPr>
           <w:sz w:val="18"/>
         </w:rPr>
-        <w:t>Continuous</w:t>
+        <w:t>Sprint</w:t>
       </w:r>
       <w:r>
         <w:rPr>
@@ -780,7 +1606,163 @@
         <w:rPr>
           <w:sz w:val="18"/>
         </w:rPr>
-        <w:t>, e-mail notifications</w:t>
+        <w:t>,</w:t>
+      </w:r>
+      <w:r>
+        <w:rPr>
+          <w:sz w:val="18"/>
+        </w:rPr>
+        <w:t xml:space="preserve"> vouchers,</w:t>
+      </w:r>
+      <w:r>
+        <w:rPr>
+          <w:sz w:val="18"/>
+        </w:rPr>
+        <w:t xml:space="preserve"> e-mail notifications</w:t>
+      </w:r>
+    </w:p>
+    <w:p>
+      <w:pPr>
+        <w:pStyle w:val="ListeParagraf"/>
+        <w:numPr>
+          <w:ilvl w:val="1"/>
+          <w:numId w:val="9"/>
+        </w:numPr>
+        <w:tabs>
+          <w:tab w:val="left" w:pos="426"/>
+        </w:tabs>
+        <w:spacing w:line="276" w:lineRule="auto"/>
+        <w:ind w:left="709"/>
+        <w:rPr>
+          <w:sz w:val="18"/>
+        </w:rPr>
+      </w:pPr>
+      <w:r>
+        <w:rPr>
+          <w:spacing w:val="-2"/>
+          <w:sz w:val="18"/>
+        </w:rPr>
+        <w:t>C</w:t>
+      </w:r>
+      <w:r>
+        <w:rPr>
+          <w:spacing w:val="-2"/>
+          <w:sz w:val="18"/>
+        </w:rPr>
+        <w:t xml:space="preserve">ollecting </w:t>
+      </w:r>
+      <w:r>
+        <w:rPr>
+          <w:spacing w:val="-2"/>
+          <w:sz w:val="18"/>
+        </w:rPr>
+        <w:t xml:space="preserve">and merging ideas from different </w:t>
+      </w:r>
+      <w:r>
+        <w:rPr>
+          <w:spacing w:val="-2"/>
+          <w:sz w:val="18"/>
+        </w:rPr>
+        <w:t>stakeholders</w:t>
+      </w:r>
+    </w:p>
+    <w:p>
+      <w:pPr>
+        <w:pStyle w:val="ListeParagraf"/>
+        <w:numPr>
+          <w:ilvl w:val="1"/>
+          <w:numId w:val="9"/>
+        </w:numPr>
+        <w:tabs>
+          <w:tab w:val="left" w:pos="426"/>
+        </w:tabs>
+        <w:spacing w:line="276" w:lineRule="auto"/>
+        <w:ind w:left="709"/>
+        <w:rPr>
+          <w:sz w:val="18"/>
+        </w:rPr>
+      </w:pPr>
+      <w:r>
+        <w:rPr>
+          <w:sz w:val="18"/>
+        </w:rPr>
+        <w:t xml:space="preserve">Market research for </w:t>
+      </w:r>
+      <w:r>
+        <w:rPr>
+          <w:sz w:val="18"/>
+        </w:rPr>
+        <w:t>different service providers</w:t>
+      </w:r>
+    </w:p>
+    <w:p>
+      <w:pPr>
+        <w:pStyle w:val="ListeParagraf"/>
+        <w:numPr>
+          <w:ilvl w:val="1"/>
+          <w:numId w:val="9"/>
+        </w:numPr>
+        <w:tabs>
+          <w:tab w:val="left" w:pos="426"/>
+        </w:tabs>
+        <w:spacing w:line="276" w:lineRule="auto"/>
+        <w:ind w:left="709"/>
+        <w:rPr>
+          <w:sz w:val="18"/>
+        </w:rPr>
+      </w:pPr>
+      <w:r>
+        <w:rPr>
+          <w:sz w:val="18"/>
+        </w:rPr>
+        <w:t>A/B testing and customer behavior analysis</w:t>
+      </w:r>
+    </w:p>
+    <w:p>
+      <w:pPr>
+        <w:pStyle w:val="ListeParagraf"/>
+        <w:numPr>
+          <w:ilvl w:val="1"/>
+          <w:numId w:val="9"/>
+        </w:numPr>
+        <w:tabs>
+          <w:tab w:val="left" w:pos="426"/>
+        </w:tabs>
+        <w:spacing w:line="276" w:lineRule="auto"/>
+        <w:ind w:left="709"/>
+        <w:rPr>
+          <w:sz w:val="18"/>
+        </w:rPr>
+      </w:pPr>
+      <w:r>
+        <w:rPr>
+          <w:sz w:val="18"/>
+        </w:rPr>
+        <w:t xml:space="preserve">UX (User Experience) </w:t>
+      </w:r>
+      <w:r>
+        <w:rPr>
+          <w:sz w:val="18"/>
+        </w:rPr>
+        <w:t xml:space="preserve">contributions, </w:t>
+      </w:r>
+      <w:r>
+        <w:rPr>
+          <w:sz w:val="18"/>
+        </w:rPr>
+        <w:t>tests</w:t>
+      </w:r>
+      <w:r>
+        <w:rPr>
+          <w:sz w:val="18"/>
+        </w:rPr>
+        <w:t xml:space="preserve"> </w:t>
+      </w:r>
+      <w:r>
+        <w:rPr>
+          <w:sz w:val="18"/>
+        </w:rPr>
+        <w:t>and improvements</w:t>
       </w:r>
     </w:p>
     <w:p>
@@ -846,23 +1828,70 @@
       <w:pPr>
         <w:pStyle w:val="ListeParagraf"/>
         <w:numPr>
-          <w:ilvl w:val="0"/>
+          <w:ilvl w:val="1"/>
           <w:numId w:val="9"/>
         </w:numPr>
         <w:tabs>
           <w:tab w:val="left" w:pos="426"/>
         </w:tabs>
         <w:spacing w:line="276" w:lineRule="auto"/>
-        <w:ind w:left="142" w:firstLine="0"/>
-        <w:rPr>
-          <w:sz w:val="18"/>
-        </w:rPr>
-      </w:pPr>
-      <w:r>
-        <w:rPr>
-          <w:sz w:val="18"/>
-        </w:rPr>
-        <w:t>Customer data management and communication (HubSpot)</w:t>
+        <w:ind w:left="709"/>
+        <w:rPr>
+          <w:sz w:val="18"/>
+        </w:rPr>
+      </w:pPr>
+      <w:r>
+        <w:rPr>
+          <w:sz w:val="18"/>
+        </w:rPr>
+        <w:t>C</w:t>
+      </w:r>
+      <w:r>
+        <w:rPr>
+          <w:sz w:val="18"/>
+        </w:rPr>
+        <w:t xml:space="preserve">ollecting </w:t>
+      </w:r>
+      <w:r>
+        <w:rPr>
+          <w:sz w:val="18"/>
+        </w:rPr>
+        <w:t xml:space="preserve">timezone, </w:t>
+      </w:r>
+      <w:r>
+        <w:rPr>
+          <w:sz w:val="18"/>
+        </w:rPr>
+        <w:t>translation and design needs</w:t>
+      </w:r>
+      <w:r>
+        <w:rPr>
+          <w:sz w:val="18"/>
+        </w:rPr>
+        <w:t xml:space="preserve"> from different departments</w:t>
+      </w:r>
+    </w:p>
+    <w:p>
+      <w:pPr>
+        <w:pStyle w:val="ListeParagraf"/>
+        <w:numPr>
+          <w:ilvl w:val="1"/>
+          <w:numId w:val="9"/>
+        </w:numPr>
+        <w:tabs>
+          <w:tab w:val="left" w:pos="426"/>
+        </w:tabs>
+        <w:spacing w:line="276" w:lineRule="auto"/>
+        <w:ind w:left="709"/>
+        <w:rPr>
+          <w:sz w:val="18"/>
+        </w:rPr>
+      </w:pPr>
+      <w:r>
+        <w:rPr>
+          <w:sz w:val="18"/>
+        </w:rPr>
+        <w:t>Managing a tight deadline for a successful project delivery</w:t>
       </w:r>
     </w:p>
     <w:p>
@@ -878,6 +1907,93 @@
         <w:spacing w:line="276" w:lineRule="auto"/>
         <w:ind w:left="142" w:firstLine="0"/>
         <w:rPr>
+          <w:sz w:val="18"/>
+        </w:rPr>
+      </w:pPr>
+      <w:r>
+        <w:rPr>
+          <w:sz w:val="18"/>
+        </w:rPr>
+        <w:t>Customer data management and communication (HubSpot)</w:t>
+      </w:r>
+    </w:p>
+    <w:p>
+      <w:pPr>
+        <w:pStyle w:val="ListeParagraf"/>
+        <w:numPr>
+          <w:ilvl w:val="1"/>
+          <w:numId w:val="9"/>
+        </w:numPr>
+        <w:tabs>
+          <w:tab w:val="left" w:pos="426"/>
+        </w:tabs>
+        <w:spacing w:line="276" w:lineRule="auto"/>
+        <w:ind w:left="709"/>
+        <w:rPr>
+          <w:sz w:val="18"/>
+        </w:rPr>
+      </w:pPr>
+      <w:r>
+        <w:rPr>
+          <w:sz w:val="18"/>
+        </w:rPr>
+        <w:t xml:space="preserve">Guiding and supporting Customer Support team to resolve </w:t>
+      </w:r>
+      <w:r>
+        <w:rPr>
+          <w:sz w:val="18"/>
+        </w:rPr>
+        <w:t>customer facing issues</w:t>
+      </w:r>
+    </w:p>
+    <w:p>
+      <w:pPr>
+        <w:pStyle w:val="ListeParagraf"/>
+        <w:numPr>
+          <w:ilvl w:val="1"/>
+          <w:numId w:val="9"/>
+        </w:numPr>
+        <w:tabs>
+          <w:tab w:val="left" w:pos="426"/>
+        </w:tabs>
+        <w:spacing w:line="276" w:lineRule="auto"/>
+        <w:ind w:left="709"/>
+        <w:rPr>
+          <w:sz w:val="18"/>
+        </w:rPr>
+      </w:pPr>
+      <w:r>
+        <w:rPr>
+          <w:sz w:val="18"/>
+        </w:rPr>
+        <w:t xml:space="preserve">Updating </w:t>
+      </w:r>
+      <w:r>
+        <w:rPr>
+          <w:sz w:val="18"/>
+        </w:rPr>
+        <w:t>data layout</w:t>
+      </w:r>
+      <w:r>
+        <w:rPr>
+          <w:sz w:val="18"/>
+        </w:rPr>
+        <w:t xml:space="preserve"> based on customer needs</w:t>
+      </w:r>
+    </w:p>
+    <w:p>
+      <w:pPr>
+        <w:pStyle w:val="ListeParagraf"/>
+        <w:numPr>
+          <w:ilvl w:val="0"/>
+          <w:numId w:val="9"/>
+        </w:numPr>
+        <w:tabs>
+          <w:tab w:val="left" w:pos="426"/>
+        </w:tabs>
+        <w:spacing w:line="276" w:lineRule="auto"/>
+        <w:ind w:left="142" w:firstLine="0"/>
+        <w:rPr>
           <w:b/>
           <w:bCs/>
           <w:sz w:val="20"/>
@@ -904,6 +2020,109 @@
           <w:sz w:val="18"/>
         </w:rPr>
         <w:t xml:space="preserve"> (Cosmic JS)</w:t>
+      </w:r>
+    </w:p>
+    <w:p>
+      <w:pPr>
+        <w:pStyle w:val="ListeParagraf"/>
+        <w:numPr>
+          <w:ilvl w:val="1"/>
+          <w:numId w:val="9"/>
+        </w:numPr>
+        <w:tabs>
+          <w:tab w:val="left" w:pos="426"/>
+        </w:tabs>
+        <w:spacing w:line="276" w:lineRule="auto"/>
+        <w:ind w:left="709"/>
+        <w:rPr>
+          <w:b/>
+          <w:bCs/>
+          <w:sz w:val="20"/>
+          <w:szCs w:val="20"/>
+        </w:rPr>
+      </w:pPr>
+      <w:r>
+        <w:rPr>
+          <w:spacing w:val="-2"/>
+          <w:sz w:val="18"/>
+        </w:rPr>
+        <w:t>Collecting and m</w:t>
+      </w:r>
+      <w:r>
+        <w:rPr>
+          <w:spacing w:val="-2"/>
+          <w:sz w:val="18"/>
+        </w:rPr>
+        <w:t xml:space="preserve">erging ideas from </w:t>
+      </w:r>
+      <w:r>
+        <w:rPr>
+          <w:spacing w:val="-2"/>
+          <w:sz w:val="18"/>
+        </w:rPr>
+        <w:t>all</w:t>
+      </w:r>
+      <w:r>
+        <w:rPr>
+          <w:spacing w:val="-2"/>
+          <w:sz w:val="18"/>
+        </w:rPr>
+        <w:t xml:space="preserve"> departments</w:t>
+      </w:r>
+      <w:r>
+        <w:rPr>
+          <w:spacing w:val="-2"/>
+          <w:sz w:val="18"/>
+        </w:rPr>
+        <w:t xml:space="preserve"> for common</w:t>
+      </w:r>
+      <w:r>
+        <w:rPr>
+          <w:spacing w:val="-2"/>
+          <w:sz w:val="18"/>
+        </w:rPr>
+        <w:t xml:space="preserve"> </w:t>
+      </w:r>
+      <w:r>
+        <w:rPr>
+          <w:spacing w:val="-2"/>
+          <w:sz w:val="18"/>
+        </w:rPr>
+        <w:t xml:space="preserve">use </w:t>
+      </w:r>
+      <w:r>
+        <w:rPr>
+          <w:spacing w:val="-2"/>
+          <w:sz w:val="18"/>
+        </w:rPr>
+        <w:t>in different templates</w:t>
+      </w:r>
+    </w:p>
+    <w:p>
+      <w:pPr>
+        <w:pStyle w:val="ListeParagraf"/>
+        <w:numPr>
+          <w:ilvl w:val="1"/>
+          <w:numId w:val="9"/>
+        </w:numPr>
+        <w:tabs>
+          <w:tab w:val="left" w:pos="426"/>
+        </w:tabs>
+        <w:spacing w:line="276" w:lineRule="auto"/>
+        <w:ind w:left="709"/>
+        <w:rPr>
+          <w:b/>
+          <w:bCs/>
+          <w:sz w:val="20"/>
+          <w:szCs w:val="20"/>
+        </w:rPr>
+      </w:pPr>
+      <w:r>
+        <w:rPr>
+          <w:spacing w:val="-2"/>
+          <w:sz w:val="18"/>
+        </w:rPr>
+        <w:t>Altering data structure based on UX needs</w:t>
       </w:r>
       <w:r>
         <w:rPr>
@@ -934,15 +2153,6 @@
           <w:szCs w:val="18"/>
         </w:rPr>
         <w:t>Tech Management</w:t>
-      </w:r>
-      <w:r>
-        <w:rPr>
-          <w:b/>
-          <w:bCs/>
-          <w:sz w:val="18"/>
-          <w:szCs w:val="18"/>
-        </w:rPr>
-        <w:t xml:space="preserve"> highlights</w:t>
       </w:r>
     </w:p>
     <w:p>
@@ -965,13 +2175,31 @@
         <w:rPr>
           <w:sz w:val="18"/>
         </w:rPr>
-        <w:t>Documentation</w:t>
-      </w:r>
-      <w:r>
-        <w:rPr>
-          <w:sz w:val="18"/>
-        </w:rPr>
-        <w:t>, development and monitoring of b</w:t>
+        <w:t>Document</w:t>
+      </w:r>
+      <w:r>
+        <w:rPr>
+          <w:sz w:val="18"/>
+        </w:rPr>
+        <w:t>ing</w:t>
+      </w:r>
+      <w:r>
+        <w:rPr>
+          <w:sz w:val="18"/>
+        </w:rPr>
+        <w:t xml:space="preserve">, </w:t>
+      </w:r>
+      <w:r>
+        <w:rPr>
+          <w:sz w:val="18"/>
+        </w:rPr>
+        <w:t>developing,</w:t>
+      </w:r>
+      <w:r>
+        <w:rPr>
+          <w:sz w:val="18"/>
+        </w:rPr>
+        <w:t xml:space="preserve"> and monitoring of b</w:t>
       </w:r>
       <w:r>
         <w:rPr>
@@ -1091,21 +2319,7 @@
         <w:rPr>
           <w:sz w:val="18"/>
         </w:rPr>
-        <w:t xml:space="preserve">Netlify, </w:t>
-      </w:r>
-      <w:proofErr w:type="spellStart"/>
-      <w:r>
-        <w:rPr>
-          <w:sz w:val="18"/>
-        </w:rPr>
-        <w:t>Vercel</w:t>
-      </w:r>
-      <w:proofErr w:type="spellEnd"/>
-      <w:r>
-        <w:rPr>
-          <w:sz w:val="18"/>
-        </w:rPr>
-        <w:t xml:space="preserve">, </w:t>
+        <w:t xml:space="preserve">Netlify, Vercel, </w:t>
       </w:r>
       <w:r>
         <w:rPr>
@@ -1212,6 +2426,13 @@
         </w:rPr>
         <w:t>members</w:t>
       </w:r>
+      <w:r>
+        <w:rPr>
+          <w:spacing w:val="-2"/>
+          <w:sz w:val="18"/>
+        </w:rPr>
+        <w:t xml:space="preserve">. </w:t>
+      </w:r>
     </w:p>
     <w:p>
       <w:pPr>
@@ -1325,24 +2546,42 @@
     <w:p>
       <w:pPr>
         <w:tabs>
-          <w:tab w:val="left" w:pos="567"/>
+          <w:tab w:val="left" w:pos="426"/>
         </w:tabs>
-        <w:ind w:firstLine="131"/>
-        <w:rPr>
-          <w:sz w:val="6"/>
-          <w:szCs w:val="6"/>
-        </w:rPr>
-      </w:pPr>
-      <w:r>
-        <w:br w:type="column"/>
-      </w:r>
+        <w:spacing w:line="276" w:lineRule="auto"/>
+        <w:rPr>
+          <w:sz w:val="18"/>
+        </w:rPr>
+      </w:pPr>
+    </w:p>
+    <w:p>
+      <w:pPr>
+        <w:tabs>
+          <w:tab w:val="left" w:pos="426"/>
+        </w:tabs>
+        <w:spacing w:line="276" w:lineRule="auto"/>
+        <w:rPr>
+          <w:sz w:val="18"/>
+        </w:rPr>
+      </w:pPr>
+    </w:p>
+    <w:p>
+      <w:pPr>
+        <w:tabs>
+          <w:tab w:val="left" w:pos="426"/>
+        </w:tabs>
+        <w:spacing w:line="276" w:lineRule="auto"/>
+        <w:rPr>
+          <w:sz w:val="18"/>
+        </w:rPr>
+      </w:pPr>
     </w:p>
     <w:p>
       <w:pPr>
         <w:tabs>
           <w:tab w:val="left" w:pos="567"/>
         </w:tabs>
-        <w:spacing w:line="276" w:lineRule="auto"/>
+        <w:spacing w:line="360" w:lineRule="auto"/>
         <w:ind w:firstLine="131"/>
         <w:rPr>
           <w:sz w:val="20"/>
@@ -1401,6 +2640,85 @@
     </w:p>
     <w:p>
       <w:pPr>
+        <w:spacing w:before="61" w:line="360" w:lineRule="auto"/>
+        <w:ind w:left="131"/>
+        <w:rPr>
+          <w:i/>
+          <w:spacing w:val="-2"/>
+          <w:sz w:val="18"/>
+        </w:rPr>
+      </w:pPr>
+      <w:r>
+        <w:rPr>
+          <w:i/>
+          <w:sz w:val="18"/>
+        </w:rPr>
+        <w:t>SaaS</w:t>
+      </w:r>
+      <w:r>
+        <w:rPr>
+          <w:i/>
+          <w:spacing w:val="-8"/>
+          <w:sz w:val="18"/>
+        </w:rPr>
+        <w:t xml:space="preserve"> </w:t>
+      </w:r>
+      <w:r>
+        <w:rPr>
+          <w:i/>
+          <w:sz w:val="18"/>
+        </w:rPr>
+        <w:t>for</w:t>
+      </w:r>
+      <w:r>
+        <w:rPr>
+          <w:i/>
+          <w:spacing w:val="-7"/>
+          <w:sz w:val="18"/>
+        </w:rPr>
+        <w:t xml:space="preserve"> </w:t>
+      </w:r>
+      <w:r>
+        <w:rPr>
+          <w:i/>
+          <w:sz w:val="18"/>
+        </w:rPr>
+        <w:t>Solar</w:t>
+      </w:r>
+      <w:r>
+        <w:rPr>
+          <w:i/>
+          <w:spacing w:val="-7"/>
+          <w:sz w:val="18"/>
+        </w:rPr>
+        <w:t xml:space="preserve"> </w:t>
+      </w:r>
+      <w:r>
+        <w:rPr>
+          <w:i/>
+          <w:sz w:val="18"/>
+        </w:rPr>
+        <w:t>Asset</w:t>
+      </w:r>
+      <w:r>
+        <w:rPr>
+          <w:i/>
+          <w:spacing w:val="-7"/>
+          <w:sz w:val="18"/>
+        </w:rPr>
+        <w:t xml:space="preserve"> </w:t>
+      </w:r>
+      <w:r>
+        <w:rPr>
+          <w:i/>
+          <w:spacing w:val="-2"/>
+          <w:sz w:val="18"/>
+        </w:rPr>
+        <w:t>Management</w:t>
+      </w:r>
+    </w:p>
+    <w:p>
+      <w:pPr>
         <w:spacing w:before="71" w:line="276" w:lineRule="auto"/>
         <w:ind w:firstLine="131"/>
         <w:rPr>
@@ -1516,85 +2834,6 @@
           <w:sz w:val="18"/>
         </w:rPr>
         <w:t>Senior Software Engineer</w:t>
-      </w:r>
-    </w:p>
-    <w:p>
-      <w:pPr>
-        <w:spacing w:before="61"/>
-        <w:ind w:left="131"/>
-        <w:rPr>
-          <w:i/>
-          <w:spacing w:val="-2"/>
-          <w:sz w:val="18"/>
-        </w:rPr>
-      </w:pPr>
-      <w:r>
-        <w:rPr>
-          <w:i/>
-          <w:sz w:val="18"/>
-        </w:rPr>
-        <w:t>SaaS</w:t>
-      </w:r>
-      <w:r>
-        <w:rPr>
-          <w:i/>
-          <w:spacing w:val="-8"/>
-          <w:sz w:val="18"/>
-        </w:rPr>
-        <w:t xml:space="preserve"> </w:t>
-      </w:r>
-      <w:r>
-        <w:rPr>
-          <w:i/>
-          <w:sz w:val="18"/>
-        </w:rPr>
-        <w:t>for</w:t>
-      </w:r>
-      <w:r>
-        <w:rPr>
-          <w:i/>
-          <w:spacing w:val="-7"/>
-          <w:sz w:val="18"/>
-        </w:rPr>
-        <w:t xml:space="preserve"> </w:t>
-      </w:r>
-      <w:r>
-        <w:rPr>
-          <w:i/>
-          <w:sz w:val="18"/>
-        </w:rPr>
-        <w:t>Solar</w:t>
-      </w:r>
-      <w:r>
-        <w:rPr>
-          <w:i/>
-          <w:spacing w:val="-7"/>
-          <w:sz w:val="18"/>
-        </w:rPr>
-        <w:t xml:space="preserve"> </w:t>
-      </w:r>
-      <w:r>
-        <w:rPr>
-          <w:i/>
-          <w:sz w:val="18"/>
-        </w:rPr>
-        <w:t>Asset</w:t>
-      </w:r>
-      <w:r>
-        <w:rPr>
-          <w:i/>
-          <w:spacing w:val="-7"/>
-          <w:sz w:val="18"/>
-        </w:rPr>
-        <w:t xml:space="preserve"> </w:t>
-      </w:r>
-      <w:r>
-        <w:rPr>
-          <w:i/>
-          <w:spacing w:val="-2"/>
-          <w:sz w:val="18"/>
-        </w:rPr>
-        <w:t>Management</w:t>
       </w:r>
     </w:p>
     <w:p>
@@ -1640,15 +2879,6 @@
           <w:szCs w:val="18"/>
         </w:rPr>
         <w:t>Team Lead</w:t>
-      </w:r>
-      <w:r>
-        <w:rPr>
-          <w:b/>
-          <w:bCs/>
-          <w:sz w:val="18"/>
-          <w:szCs w:val="18"/>
-        </w:rPr>
-        <w:t xml:space="preserve"> highlights</w:t>
       </w:r>
     </w:p>
     <w:p>
@@ -1765,19 +2995,7 @@
         <w:rPr>
           <w:sz w:val="18"/>
         </w:rPr>
-        <w:t>Contributi</w:t>
-      </w:r>
-      <w:r>
-        <w:rPr>
-          <w:sz w:val="18"/>
-        </w:rPr>
-        <w:t>ng</w:t>
-      </w:r>
-      <w:r>
-        <w:rPr>
-          <w:sz w:val="18"/>
-        </w:rPr>
-        <w:t xml:space="preserve"> to</w:t>
+        <w:t>Contributing to</w:t>
       </w:r>
       <w:r>
         <w:rPr>
@@ -1795,13 +3013,7 @@
         <w:rPr>
           <w:sz w:val="18"/>
         </w:rPr>
-        <w:t>employee policie</w:t>
-      </w:r>
-      <w:r>
-        <w:rPr>
-          <w:sz w:val="18"/>
-        </w:rPr>
-        <w:t>s</w:t>
+        <w:t>employee policies</w:t>
       </w:r>
     </w:p>
     <w:p>
@@ -1903,15 +3115,6 @@
         </w:rPr>
         <w:t>Engineering</w:t>
       </w:r>
-      <w:r>
-        <w:rPr>
-          <w:b/>
-          <w:bCs/>
-          <w:sz w:val="18"/>
-          <w:szCs w:val="18"/>
-        </w:rPr>
-        <w:t xml:space="preserve"> highlights</w:t>
-      </w:r>
     </w:p>
     <w:p>
       <w:pPr>
@@ -1933,43 +3136,14 @@
         <w:rPr>
           <w:sz w:val="18"/>
         </w:rPr>
-        <w:t xml:space="preserve">Development and monitoring of backend services in Python </w:t>
-      </w:r>
-      <w:r>
-        <w:rPr>
-          <w:sz w:val="18"/>
-        </w:rPr>
-        <w:t xml:space="preserve">and its </w:t>
-      </w:r>
-      <w:r>
-        <w:rPr>
-          <w:sz w:val="18"/>
-        </w:rPr>
-        <w:t>Django Framework</w:t>
+        <w:t>Development and monitoring of backend services in Python and its Django Framework</w:t>
       </w:r>
       <w:r>
         <w:rPr>
           <w:sz w:val="18"/>
         </w:rPr>
         <w:br/>
-      </w:r>
-      <w:r>
-        <w:rPr>
-          <w:sz w:val="18"/>
-        </w:rPr>
-        <w:t>(Heroku, AWS, PostgreSQL</w:t>
-      </w:r>
-      <w:r>
-        <w:rPr>
-          <w:sz w:val="18"/>
-        </w:rPr>
-        <w:t>, Redis</w:t>
-      </w:r>
-      <w:r>
-        <w:rPr>
-          <w:sz w:val="18"/>
-        </w:rPr>
-        <w:t>)</w:t>
+        <w:t>(Heroku, AWS, PostgreSQL, Redis)</w:t>
       </w:r>
     </w:p>
     <w:p>
@@ -1992,19 +3166,7 @@
         <w:rPr>
           <w:sz w:val="18"/>
         </w:rPr>
-        <w:t>Preparing</w:t>
-      </w:r>
-      <w:r>
-        <w:rPr>
-          <w:sz w:val="18"/>
-        </w:rPr>
-        <w:t xml:space="preserve"> and updating</w:t>
-      </w:r>
-      <w:r>
-        <w:rPr>
-          <w:sz w:val="18"/>
-        </w:rPr>
-        <w:t xml:space="preserve"> the platform for a SOC Audit</w:t>
+        <w:t>Preparing and updating the platform for a SOC Audit</w:t>
       </w:r>
     </w:p>
     <w:p>
@@ -2067,33 +3229,14 @@
           <w:spacing w:val="-2"/>
           <w:sz w:val="18"/>
         </w:rPr>
-        <w:t xml:space="preserve">as a speaker at </w:t>
-      </w:r>
-      <w:proofErr w:type="spellStart"/>
-      <w:r>
-        <w:rPr>
-          <w:spacing w:val="-2"/>
-          <w:sz w:val="18"/>
-        </w:rPr>
-        <w:t>PyCon</w:t>
-      </w:r>
-      <w:proofErr w:type="spellEnd"/>
-      <w:r>
-        <w:rPr>
-          <w:spacing w:val="-2"/>
-          <w:sz w:val="18"/>
-        </w:rPr>
-        <w:t xml:space="preserve"> Web</w:t>
-      </w:r>
-    </w:p>
-    <w:p>
-      <w:pPr>
-        <w:pStyle w:val="ListeParagraf"/>
+        <w:t>as a speaker at PyCon Web</w:t>
+      </w:r>
+    </w:p>
+    <w:p>
+      <w:pPr>
         <w:tabs>
-          <w:tab w:val="left" w:pos="426"/>
+          <w:tab w:val="left" w:pos="567"/>
         </w:tabs>
-        <w:spacing w:line="276" w:lineRule="auto"/>
-        <w:ind w:left="142" w:right="232" w:firstLine="0"/>
         <w:rPr>
           <w:sz w:val="18"/>
         </w:rPr>
@@ -2102,33 +3245,17 @@
     <w:p>
       <w:pPr>
         <w:tabs>
-          <w:tab w:val="left" w:pos="142"/>
+          <w:tab w:val="left" w:pos="567"/>
         </w:tabs>
-        <w:spacing w:before="57" w:line="276" w:lineRule="auto"/>
-        <w:ind w:right="873"/>
-        <w:rPr>
-          <w:b/>
-          <w:bCs/>
-          <w:sz w:val="20"/>
-          <w:szCs w:val="20"/>
-        </w:rPr>
-      </w:pPr>
-    </w:p>
-    <w:p>
-      <w:pPr>
-        <w:tabs>
-          <w:tab w:val="left" w:pos="142"/>
-        </w:tabs>
-        <w:spacing w:before="57" w:line="276" w:lineRule="auto"/>
-        <w:ind w:right="873"/>
-        <w:rPr>
-          <w:sz w:val="18"/>
+        <w:rPr>
+          <w:sz w:val="6"/>
+          <w:szCs w:val="6"/>
         </w:rPr>
         <w:sectPr>
           <w:type w:val="continuous"/>
           <w:pgSz w:w="11910" w:h="16840"/>
-          <w:pgMar w:top="300" w:right="380" w:bottom="1020" w:left="560" w:header="0" w:footer="837" w:gutter="0"/>
-          <w:cols w:num="2" w:sep="1" w:space="284"/>
+          <w:pgMar w:top="300" w:right="2412" w:bottom="1135" w:left="560" w:header="0" w:footer="837" w:gutter="0"/>
+          <w:cols w:sep="1" w:space="720"/>
         </w:sectPr>
       </w:pPr>
     </w:p>
@@ -2140,7 +3267,7 @@
         <w:sectPr>
           <w:type w:val="continuous"/>
           <w:pgSz w:w="11910" w:h="16840"/>
-          <w:pgMar w:top="300" w:right="380" w:bottom="1020" w:left="560" w:header="0" w:footer="837" w:gutter="0"/>
+          <w:pgMar w:top="300" w:right="1704" w:bottom="1020" w:left="560" w:header="0" w:footer="837" w:gutter="0"/>
           <w:cols w:space="708"/>
         </w:sectPr>
       </w:pPr>
@@ -2148,341 +3275,318 @@
     <w:p>
       <w:pPr>
         <w:pStyle w:val="Balk1"/>
-        <w:ind w:left="0" w:firstLine="142"/>
+        <w:spacing w:line="360" w:lineRule="auto"/>
+        <w:ind w:left="142"/>
+        <w:rPr>
+          <w:b w:val="0"/>
+          <w:bCs w:val="0"/>
+          <w:sz w:val="18"/>
+          <w:szCs w:val="18"/>
+        </w:rPr>
+      </w:pPr>
+      <w:r>
+        <w:rPr>
+          <w:sz w:val="18"/>
+          <w:szCs w:val="18"/>
+        </w:rPr>
+        <w:t>Programming Languages</w:t>
+      </w:r>
+      <w:r>
+        <w:rPr>
+          <w:sz w:val="18"/>
+          <w:szCs w:val="18"/>
+        </w:rPr>
+        <w:t>:</w:t>
+      </w:r>
+      <w:r>
+        <w:rPr>
+          <w:sz w:val="18"/>
+          <w:szCs w:val="18"/>
+        </w:rPr>
+        <w:t xml:space="preserve"> </w:t>
+      </w:r>
+      <w:r>
+        <w:rPr>
+          <w:b w:val="0"/>
+          <w:bCs w:val="0"/>
+          <w:sz w:val="18"/>
+          <w:szCs w:val="18"/>
+        </w:rPr>
+        <w:t>Efficien</w:t>
+      </w:r>
+      <w:r>
+        <w:rPr>
+          <w:b w:val="0"/>
+          <w:bCs w:val="0"/>
+          <w:sz w:val="18"/>
+          <w:szCs w:val="18"/>
+        </w:rPr>
+        <w:t>cy</w:t>
+      </w:r>
+      <w:r>
+        <w:rPr>
+          <w:b w:val="0"/>
+          <w:bCs w:val="0"/>
+          <w:sz w:val="18"/>
+          <w:szCs w:val="18"/>
+        </w:rPr>
+        <w:t xml:space="preserve"> in Python, JavaScript (TypeScript). Medium experience in </w:t>
+      </w:r>
+      <w:r>
+        <w:rPr>
+          <w:b w:val="0"/>
+          <w:bCs w:val="0"/>
+          <w:sz w:val="18"/>
+          <w:szCs w:val="18"/>
+        </w:rPr>
+        <w:t xml:space="preserve">Ruby, Swift, </w:t>
+      </w:r>
+      <w:r>
+        <w:rPr>
+          <w:b w:val="0"/>
+          <w:bCs w:val="0"/>
+          <w:sz w:val="18"/>
+          <w:szCs w:val="18"/>
+        </w:rPr>
+        <w:t>C</w:t>
+      </w:r>
+      <w:r>
+        <w:rPr>
+          <w:b w:val="0"/>
+          <w:bCs w:val="0"/>
+          <w:sz w:val="18"/>
+          <w:szCs w:val="18"/>
+        </w:rPr>
+        <w:t>#.</w:t>
+      </w:r>
+      <w:r>
         <w:rPr>
           <w:color w:val="C00000"/>
-        </w:rPr>
-      </w:pPr>
+          <w:sz w:val="18"/>
+          <w:szCs w:val="18"/>
+        </w:rPr>
+        <w:br/>
+      </w:r>
+      <w:r>
+        <w:rPr>
+          <w:sz w:val="18"/>
+          <w:szCs w:val="18"/>
+        </w:rPr>
+        <w:t>Tool Experience</w:t>
+      </w:r>
+      <w:r>
+        <w:rPr>
+          <w:sz w:val="18"/>
+          <w:szCs w:val="18"/>
+        </w:rPr>
+        <w:t>:</w:t>
+      </w:r>
+      <w:r>
+        <w:rPr>
+          <w:b w:val="0"/>
+          <w:bCs w:val="0"/>
+          <w:sz w:val="18"/>
+          <w:szCs w:val="18"/>
+        </w:rPr>
+        <w:t xml:space="preserve"> </w:t>
+      </w:r>
+      <w:r>
+        <w:rPr>
+          <w:b w:val="0"/>
+          <w:bCs w:val="0"/>
+          <w:sz w:val="18"/>
+          <w:szCs w:val="18"/>
+        </w:rPr>
+        <w:t>Google Analytics,</w:t>
+      </w:r>
+      <w:r>
+        <w:rPr>
+          <w:b w:val="0"/>
+          <w:bCs w:val="0"/>
+          <w:sz w:val="18"/>
+          <w:szCs w:val="18"/>
+        </w:rPr>
+        <w:t xml:space="preserve"> </w:t>
+      </w:r>
+      <w:r>
+        <w:rPr>
+          <w:b w:val="0"/>
+          <w:bCs w:val="0"/>
+          <w:sz w:val="18"/>
+          <w:szCs w:val="18"/>
+        </w:rPr>
+        <w:t>Google Workspace,</w:t>
+      </w:r>
+      <w:r>
+        <w:rPr>
+          <w:b w:val="0"/>
+          <w:bCs w:val="0"/>
+          <w:sz w:val="18"/>
+          <w:szCs w:val="18"/>
+        </w:rPr>
+        <w:t xml:space="preserve"> </w:t>
+      </w:r>
+      <w:r>
+        <w:rPr>
+          <w:b w:val="0"/>
+          <w:bCs w:val="0"/>
+          <w:sz w:val="18"/>
+          <w:szCs w:val="18"/>
+        </w:rPr>
+        <w:t>Jira,</w:t>
+      </w:r>
+      <w:r>
+        <w:rPr>
+          <w:b w:val="0"/>
+          <w:bCs w:val="0"/>
+          <w:sz w:val="18"/>
+          <w:szCs w:val="18"/>
+        </w:rPr>
+        <w:t xml:space="preserve"> Confluence,</w:t>
+      </w:r>
+      <w:r>
+        <w:rPr>
+          <w:b w:val="0"/>
+          <w:bCs w:val="0"/>
+          <w:sz w:val="18"/>
+          <w:szCs w:val="18"/>
+        </w:rPr>
+        <w:t xml:space="preserve"> </w:t>
+      </w:r>
+      <w:r>
+        <w:rPr>
+          <w:b w:val="0"/>
+          <w:bCs w:val="0"/>
+          <w:sz w:val="18"/>
+          <w:szCs w:val="18"/>
+        </w:rPr>
+        <w:t xml:space="preserve">Monday, </w:t>
+      </w:r>
+      <w:r>
+        <w:rPr>
+          <w:b w:val="0"/>
+          <w:bCs w:val="0"/>
+          <w:sz w:val="18"/>
+          <w:szCs w:val="18"/>
+        </w:rPr>
+        <w:t xml:space="preserve">Userpilot, </w:t>
+      </w:r>
+      <w:r>
+        <w:rPr>
+          <w:b w:val="0"/>
+          <w:bCs w:val="0"/>
+          <w:sz w:val="18"/>
+          <w:szCs w:val="18"/>
+        </w:rPr>
+        <w:t>Trello,</w:t>
+      </w:r>
+      <w:r>
+        <w:rPr>
+          <w:b w:val="0"/>
+          <w:bCs w:val="0"/>
+          <w:sz w:val="18"/>
+          <w:szCs w:val="18"/>
+        </w:rPr>
+        <w:t xml:space="preserve"> Miro, Figma, </w:t>
+      </w:r>
+      <w:r>
+        <w:rPr>
+          <w:b w:val="0"/>
+          <w:bCs w:val="0"/>
+          <w:sz w:val="18"/>
+          <w:szCs w:val="18"/>
+        </w:rPr>
+        <w:t xml:space="preserve">Notion, </w:t>
+      </w:r>
+      <w:r>
+        <w:rPr>
+          <w:b w:val="0"/>
+          <w:bCs w:val="0"/>
+          <w:sz w:val="18"/>
+          <w:szCs w:val="18"/>
+        </w:rPr>
+        <w:t>Xcode,</w:t>
+      </w:r>
+      <w:r>
+        <w:rPr>
+          <w:b w:val="0"/>
+          <w:bCs w:val="0"/>
+          <w:sz w:val="18"/>
+          <w:szCs w:val="18"/>
+        </w:rPr>
+        <w:t xml:space="preserve"> Unity, </w:t>
+      </w:r>
+      <w:r>
+        <w:rPr>
+          <w:b w:val="0"/>
+          <w:bCs w:val="0"/>
+          <w:sz w:val="18"/>
+          <w:szCs w:val="18"/>
+        </w:rPr>
+        <w:t xml:space="preserve">Adobe (Premiere, Lightroom), </w:t>
+      </w:r>
+      <w:r>
+        <w:rPr>
+          <w:b w:val="0"/>
+          <w:bCs w:val="0"/>
+          <w:sz w:val="18"/>
+          <w:szCs w:val="18"/>
+        </w:rPr>
+        <w:t>Intercom, MS Office (Words, Excel), Airtable</w:t>
+      </w:r>
+      <w:r>
+        <w:rPr>
+          <w:b w:val="0"/>
+          <w:bCs w:val="0"/>
+          <w:sz w:val="18"/>
+          <w:szCs w:val="18"/>
+        </w:rPr>
+        <w:t>, Zoom, Slack</w:t>
+      </w:r>
+      <w:r>
+        <w:rPr>
+          <w:b w:val="0"/>
+          <w:bCs w:val="0"/>
+          <w:sz w:val="18"/>
+          <w:szCs w:val="18"/>
+        </w:rPr>
+        <w:t>…</w:t>
+      </w:r>
     </w:p>
     <w:p>
       <w:pPr>
         <w:pStyle w:val="Balk1"/>
-        <w:ind w:left="0" w:firstLine="142"/>
-        <w:rPr>
-          <w:color w:val="C00000"/>
-        </w:rPr>
-      </w:pPr>
-    </w:p>
-    <w:p>
-      <w:pPr>
-        <w:pStyle w:val="Balk1"/>
-        <w:spacing w:line="276" w:lineRule="auto"/>
+        <w:spacing w:line="360" w:lineRule="auto"/>
         <w:ind w:left="142"/>
         <w:rPr>
           <w:b w:val="0"/>
           <w:bCs w:val="0"/>
-          <w:sz w:val="18"/>
-          <w:szCs w:val="18"/>
-        </w:rPr>
-      </w:pPr>
-      <w:r>
-        <w:rPr>
-          <w:sz w:val="18"/>
-          <w:szCs w:val="18"/>
-        </w:rPr>
-        <w:t>Programming Languages</w:t>
-      </w:r>
-      <w:r>
-        <w:rPr>
-          <w:sz w:val="18"/>
-          <w:szCs w:val="18"/>
-        </w:rPr>
-        <w:t>:</w:t>
-      </w:r>
-      <w:r>
-        <w:rPr>
-          <w:sz w:val="18"/>
-          <w:szCs w:val="18"/>
-        </w:rPr>
-        <w:t xml:space="preserve"> </w:t>
-      </w:r>
-      <w:r>
-        <w:rPr>
-          <w:b w:val="0"/>
-          <w:bCs w:val="0"/>
-          <w:sz w:val="18"/>
-          <w:szCs w:val="18"/>
-        </w:rPr>
-        <w:t>Efficien</w:t>
-      </w:r>
-      <w:r>
-        <w:rPr>
-          <w:b w:val="0"/>
-          <w:bCs w:val="0"/>
-          <w:sz w:val="18"/>
-          <w:szCs w:val="18"/>
-        </w:rPr>
-        <w:t>cy</w:t>
-      </w:r>
-      <w:r>
-        <w:rPr>
-          <w:b w:val="0"/>
-          <w:bCs w:val="0"/>
-          <w:sz w:val="18"/>
-          <w:szCs w:val="18"/>
-        </w:rPr>
-        <w:t xml:space="preserve"> in Python, JavaScript (TypeScript). Medium experience in </w:t>
-      </w:r>
-      <w:r>
-        <w:rPr>
-          <w:b w:val="0"/>
-          <w:bCs w:val="0"/>
-          <w:sz w:val="18"/>
-          <w:szCs w:val="18"/>
-        </w:rPr>
-        <w:t xml:space="preserve">Ruby, Swift, </w:t>
-      </w:r>
-      <w:r>
-        <w:rPr>
-          <w:b w:val="0"/>
-          <w:bCs w:val="0"/>
-          <w:sz w:val="18"/>
-          <w:szCs w:val="18"/>
-        </w:rPr>
-        <w:t>C</w:t>
-      </w:r>
-      <w:r>
-        <w:rPr>
-          <w:b w:val="0"/>
-          <w:bCs w:val="0"/>
-          <w:sz w:val="18"/>
-          <w:szCs w:val="18"/>
-        </w:rPr>
-        <w:t>#.</w:t>
-      </w:r>
-      <w:r>
-        <w:rPr>
-          <w:color w:val="C00000"/>
-          <w:sz w:val="18"/>
-          <w:szCs w:val="18"/>
-        </w:rPr>
-        <w:br/>
-      </w:r>
-      <w:r>
-        <w:rPr>
-          <w:sz w:val="18"/>
-          <w:szCs w:val="18"/>
-        </w:rPr>
-        <w:t>Tool Experience</w:t>
-      </w:r>
-      <w:r>
-        <w:rPr>
-          <w:sz w:val="18"/>
-          <w:szCs w:val="18"/>
-        </w:rPr>
-        <w:t>:</w:t>
-      </w:r>
-      <w:r>
-        <w:rPr>
-          <w:b w:val="0"/>
-          <w:bCs w:val="0"/>
-          <w:sz w:val="18"/>
-          <w:szCs w:val="18"/>
-        </w:rPr>
-        <w:t xml:space="preserve"> </w:t>
-      </w:r>
-      <w:r>
-        <w:rPr>
-          <w:b w:val="0"/>
-          <w:bCs w:val="0"/>
-          <w:sz w:val="18"/>
-          <w:szCs w:val="18"/>
-        </w:rPr>
-        <w:t>Google Analytics,</w:t>
-      </w:r>
-      <w:r>
-        <w:rPr>
-          <w:b w:val="0"/>
-          <w:bCs w:val="0"/>
-          <w:sz w:val="18"/>
-          <w:szCs w:val="18"/>
-        </w:rPr>
-        <w:t xml:space="preserve"> </w:t>
-      </w:r>
-      <w:r>
-        <w:rPr>
-          <w:b w:val="0"/>
-          <w:bCs w:val="0"/>
-          <w:sz w:val="18"/>
-          <w:szCs w:val="18"/>
-        </w:rPr>
-        <w:t>Google Workspace,</w:t>
-      </w:r>
-      <w:r>
-        <w:rPr>
-          <w:b w:val="0"/>
-          <w:bCs w:val="0"/>
-          <w:sz w:val="18"/>
-          <w:szCs w:val="18"/>
-        </w:rPr>
-        <w:t xml:space="preserve"> </w:t>
-      </w:r>
-      <w:r>
-        <w:rPr>
-          <w:b w:val="0"/>
-          <w:bCs w:val="0"/>
-          <w:sz w:val="18"/>
-          <w:szCs w:val="18"/>
-        </w:rPr>
-        <w:t>Jira,</w:t>
-      </w:r>
-      <w:r>
-        <w:rPr>
-          <w:b w:val="0"/>
-          <w:bCs w:val="0"/>
-          <w:sz w:val="18"/>
-          <w:szCs w:val="18"/>
-        </w:rPr>
-        <w:t xml:space="preserve"> Confluence,</w:t>
-      </w:r>
-      <w:r>
-        <w:rPr>
-          <w:b w:val="0"/>
-          <w:bCs w:val="0"/>
-          <w:sz w:val="18"/>
-          <w:szCs w:val="18"/>
-        </w:rPr>
-        <w:t xml:space="preserve"> </w:t>
-      </w:r>
-      <w:r>
-        <w:rPr>
-          <w:b w:val="0"/>
-          <w:bCs w:val="0"/>
-          <w:sz w:val="18"/>
-          <w:szCs w:val="18"/>
-        </w:rPr>
-        <w:t xml:space="preserve">Monday, </w:t>
-      </w:r>
-      <w:proofErr w:type="spellStart"/>
-      <w:r>
-        <w:rPr>
-          <w:b w:val="0"/>
-          <w:bCs w:val="0"/>
-          <w:sz w:val="18"/>
-          <w:szCs w:val="18"/>
-        </w:rPr>
-        <w:t>Userpilot</w:t>
-      </w:r>
-      <w:proofErr w:type="spellEnd"/>
-      <w:r>
-        <w:rPr>
-          <w:b w:val="0"/>
-          <w:bCs w:val="0"/>
-          <w:sz w:val="18"/>
-          <w:szCs w:val="18"/>
-        </w:rPr>
-        <w:t xml:space="preserve">, </w:t>
-      </w:r>
-      <w:r>
-        <w:rPr>
-          <w:b w:val="0"/>
-          <w:bCs w:val="0"/>
-          <w:sz w:val="18"/>
-          <w:szCs w:val="18"/>
-        </w:rPr>
-        <w:t>Trello,</w:t>
-      </w:r>
-      <w:r>
-        <w:rPr>
-          <w:b w:val="0"/>
-          <w:bCs w:val="0"/>
-          <w:sz w:val="18"/>
-          <w:szCs w:val="18"/>
-        </w:rPr>
-        <w:t xml:space="preserve"> Miro, Figma, </w:t>
-      </w:r>
-      <w:r>
-        <w:rPr>
-          <w:b w:val="0"/>
-          <w:bCs w:val="0"/>
-          <w:sz w:val="18"/>
-          <w:szCs w:val="18"/>
-        </w:rPr>
-        <w:t xml:space="preserve">Notion, </w:t>
-      </w:r>
-      <w:r>
-        <w:rPr>
-          <w:b w:val="0"/>
-          <w:bCs w:val="0"/>
-          <w:sz w:val="18"/>
-          <w:szCs w:val="18"/>
-        </w:rPr>
-        <w:t>Xcode,</w:t>
-      </w:r>
-      <w:r>
-        <w:rPr>
-          <w:b w:val="0"/>
-          <w:bCs w:val="0"/>
-          <w:sz w:val="18"/>
-          <w:szCs w:val="18"/>
-        </w:rPr>
-        <w:t xml:space="preserve"> Unity, </w:t>
-      </w:r>
-      <w:r>
-        <w:rPr>
-          <w:b w:val="0"/>
-          <w:bCs w:val="0"/>
-          <w:sz w:val="18"/>
-          <w:szCs w:val="18"/>
-        </w:rPr>
-        <w:t xml:space="preserve">Adobe (Premiere, Lightroom), </w:t>
-      </w:r>
-      <w:r>
-        <w:rPr>
-          <w:b w:val="0"/>
-          <w:bCs w:val="0"/>
-          <w:sz w:val="18"/>
-          <w:szCs w:val="18"/>
-        </w:rPr>
-        <w:t xml:space="preserve">Intercom, MS Office (Words, Excel), </w:t>
-      </w:r>
-      <w:proofErr w:type="spellStart"/>
-      <w:r>
-        <w:rPr>
-          <w:b w:val="0"/>
-          <w:bCs w:val="0"/>
-          <w:sz w:val="18"/>
-          <w:szCs w:val="18"/>
-        </w:rPr>
-        <w:t>Airtable</w:t>
-      </w:r>
-      <w:proofErr w:type="spellEnd"/>
-      <w:r>
-        <w:rPr>
-          <w:b w:val="0"/>
-          <w:bCs w:val="0"/>
-          <w:sz w:val="18"/>
-          <w:szCs w:val="18"/>
-        </w:rPr>
-        <w:t>, Zoom, Slack</w:t>
-      </w:r>
-      <w:r>
-        <w:rPr>
-          <w:b w:val="0"/>
-          <w:bCs w:val="0"/>
-          <w:sz w:val="18"/>
-          <w:szCs w:val="18"/>
-        </w:rPr>
-        <w:t>…</w:t>
-      </w:r>
-    </w:p>
-    <w:p>
-      <w:pPr>
-        <w:pStyle w:val="Balk1"/>
-        <w:spacing w:line="276" w:lineRule="auto"/>
-        <w:ind w:left="142"/>
-        <w:rPr>
-          <w:color w:val="C00000"/>
           <w:sz w:val="18"/>
           <w:szCs w:val="18"/>
         </w:rPr>
         <w:sectPr>
           <w:type w:val="continuous"/>
           <w:pgSz w:w="11910" w:h="16840"/>
-          <w:pgMar w:top="300" w:right="380" w:bottom="1020" w:left="560" w:header="0" w:footer="837" w:gutter="0"/>
+          <w:pgMar w:top="300" w:right="1704" w:bottom="1020" w:left="560" w:header="0" w:footer="837" w:gutter="0"/>
           <w:cols w:space="708"/>
         </w:sectPr>
       </w:pPr>
+      <w:r>
+        <w:rPr>
+          <w:sz w:val="18"/>
+          <w:szCs w:val="18"/>
+        </w:rPr>
+        <w:t>Spoken Languages:</w:t>
+      </w:r>
+      <w:r>
+        <w:rPr>
+          <w:b w:val="0"/>
+          <w:bCs w:val="0"/>
+          <w:sz w:val="18"/>
+          <w:szCs w:val="18"/>
+        </w:rPr>
+        <w:t xml:space="preserve"> English (professional), Turkish (native)</w:t>
+      </w:r>
     </w:p>
     <w:p>
       <w:pPr>
@@ -2495,469 +3599,6 @@
         </w:rPr>
       </w:pPr>
       <w:bookmarkStart w:id="0" w:name="_Hlk190893029"/>
-    </w:p>
-    <w:p>
-      <w:pPr>
-        <w:pStyle w:val="Balk1"/>
-        <w:spacing w:before="112"/>
-        <w:ind w:left="0" w:firstLine="142"/>
-        <w:rPr>
-          <w:color w:val="C00000"/>
-        </w:rPr>
-      </w:pPr>
-      <w:r>
-        <w:rPr>
-          <w:color w:val="C00000"/>
-          <w:spacing w:val="-2"/>
-        </w:rPr>
-        <w:t>FORMAL EDUCATION</w:t>
-      </w:r>
-    </w:p>
-    <w:p>
-      <w:pPr>
-        <w:pStyle w:val="Balk3"/>
-        <w:spacing w:before="254" w:line="276" w:lineRule="auto"/>
-        <w:ind w:left="142"/>
-        <w:rPr>
-          <w:u w:val="none"/>
-        </w:rPr>
-      </w:pPr>
-      <w:r>
-        <w:rPr>
-          <w:u w:val="none"/>
-        </w:rPr>
-        <w:t xml:space="preserve">Koç </w:t>
-      </w:r>
-      <w:r>
-        <w:rPr>
-          <w:spacing w:val="-2"/>
-          <w:u w:val="none"/>
-        </w:rPr>
-        <w:t>University</w:t>
-      </w:r>
-    </w:p>
-    <w:p>
-      <w:pPr>
-        <w:pStyle w:val="Balk5"/>
-        <w:tabs>
-          <w:tab w:val="left" w:pos="200"/>
-        </w:tabs>
-        <w:spacing w:before="9" w:line="276" w:lineRule="auto"/>
-        <w:ind w:left="142" w:right="38"/>
-      </w:pPr>
-      <w:r>
-        <w:t>Istanbul,</w:t>
-      </w:r>
-      <w:r>
-        <w:rPr>
-          <w:spacing w:val="-10"/>
-        </w:rPr>
-        <w:t xml:space="preserve"> </w:t>
-      </w:r>
-      <w:r>
-        <w:t>Türkiye</w:t>
-      </w:r>
-      <w:r>
-        <w:rPr>
-          <w:spacing w:val="-10"/>
-        </w:rPr>
-        <w:t xml:space="preserve"> </w:t>
-      </w:r>
-      <w:r>
-        <w:t>—</w:t>
-      </w:r>
-      <w:r>
-        <w:rPr>
-          <w:spacing w:val="-10"/>
-        </w:rPr>
-        <w:t xml:space="preserve"> </w:t>
-      </w:r>
-      <w:r>
-        <w:t>2013</w:t>
-      </w:r>
-      <w:r>
-        <w:rPr>
-          <w:spacing w:val="-10"/>
-        </w:rPr>
-        <w:t xml:space="preserve"> </w:t>
-      </w:r>
-      <w:r>
-        <w:t>(prep</w:t>
-      </w:r>
-      <w:r>
-        <w:rPr>
-          <w:spacing w:val="-10"/>
-        </w:rPr>
-        <w:t xml:space="preserve"> </w:t>
-      </w:r>
-      <w:r>
-        <w:t>+</w:t>
-      </w:r>
-      <w:r>
-        <w:rPr>
-          <w:spacing w:val="-10"/>
-        </w:rPr>
-        <w:t xml:space="preserve"> </w:t>
-      </w:r>
-      <w:r>
-        <w:t>4</w:t>
-      </w:r>
-      <w:r>
-        <w:rPr>
-          <w:spacing w:val="-10"/>
-        </w:rPr>
-        <w:t xml:space="preserve"> </w:t>
-      </w:r>
-      <w:r>
-        <w:t xml:space="preserve">years) </w:t>
-      </w:r>
-      <w:r>
-        <w:br/>
-      </w:r>
-      <w:r>
-        <w:t>Bachelor of Science</w:t>
-      </w:r>
-      <w:r>
-        <w:br/>
-      </w:r>
-      <w:r>
-        <w:t>Computer Engineering</w:t>
-      </w:r>
-    </w:p>
-    <w:p>
-      <w:pPr>
-        <w:pStyle w:val="GvdeMetni"/>
-        <w:tabs>
-          <w:tab w:val="left" w:pos="200"/>
-        </w:tabs>
-        <w:spacing w:before="2" w:line="276" w:lineRule="auto"/>
-        <w:ind w:left="142"/>
-        <w:rPr>
-          <w:color w:val="5E5E5E"/>
-        </w:rPr>
-      </w:pPr>
-      <w:r>
-        <w:rPr>
-          <w:color w:val="5E5E5E"/>
-        </w:rPr>
-        <w:t>Clubs:</w:t>
-      </w:r>
-      <w:r>
-        <w:rPr>
-          <w:color w:val="5E5E5E"/>
-          <w:spacing w:val="-11"/>
-        </w:rPr>
-        <w:t xml:space="preserve"> </w:t>
-      </w:r>
-      <w:r>
-        <w:rPr>
-          <w:color w:val="5E5E5E"/>
-        </w:rPr>
-        <w:t>Computer,</w:t>
-      </w:r>
-      <w:r>
-        <w:rPr>
-          <w:color w:val="5E5E5E"/>
-          <w:spacing w:val="-11"/>
-        </w:rPr>
-        <w:t xml:space="preserve"> </w:t>
-      </w:r>
-      <w:r>
-        <w:rPr>
-          <w:color w:val="5E5E5E"/>
-        </w:rPr>
-        <w:t>Drama,</w:t>
-      </w:r>
-      <w:r>
-        <w:rPr>
-          <w:color w:val="5E5E5E"/>
-          <w:spacing w:val="-11"/>
-        </w:rPr>
-        <w:t xml:space="preserve"> </w:t>
-      </w:r>
-      <w:r>
-        <w:rPr>
-          <w:color w:val="5E5E5E"/>
-        </w:rPr>
-        <w:t>Management Memberships: ACM Student Chapter</w:t>
-      </w:r>
-    </w:p>
-    <w:p>
-      <w:pPr>
-        <w:jc w:val="both"/>
-      </w:pPr>
-      <w:r>
-        <w:br w:type="column"/>
-      </w:r>
-    </w:p>
-    <w:p>
-      <w:pPr>
-        <w:pStyle w:val="GvdeMetni"/>
-        <w:spacing w:before="182" w:line="276" w:lineRule="auto"/>
-        <w:rPr>
-          <w:sz w:val="24"/>
-        </w:rPr>
-      </w:pPr>
-    </w:p>
-    <w:p>
-      <w:pPr>
-        <w:pStyle w:val="Balk3"/>
-        <w:spacing w:before="0"/>
-        <w:ind w:left="0"/>
-        <w:rPr>
-          <w:sz w:val="36"/>
-          <w:szCs w:val="36"/>
-          <w:u w:val="none"/>
-        </w:rPr>
-      </w:pPr>
-    </w:p>
-    <w:p>
-      <w:pPr>
-        <w:pStyle w:val="Balk3"/>
-        <w:spacing w:before="0"/>
-        <w:rPr>
-          <w:u w:val="none"/>
-        </w:rPr>
-      </w:pPr>
-      <w:r>
-        <w:rPr>
-          <w:u w:val="none"/>
-        </w:rPr>
-        <w:t>BEM</w:t>
-      </w:r>
-      <w:r>
-        <w:rPr>
-          <w:spacing w:val="9"/>
-          <w:u w:val="none"/>
-        </w:rPr>
-        <w:t xml:space="preserve"> </w:t>
-      </w:r>
-      <w:r>
-        <w:rPr>
-          <w:u w:val="none"/>
-        </w:rPr>
-        <w:t>-</w:t>
-      </w:r>
-      <w:r>
-        <w:rPr>
-          <w:spacing w:val="9"/>
-          <w:u w:val="none"/>
-        </w:rPr>
-        <w:t xml:space="preserve"> </w:t>
-      </w:r>
-      <w:r>
-        <w:rPr>
-          <w:u w:val="none"/>
-        </w:rPr>
-        <w:t>Bordeaux</w:t>
-      </w:r>
-      <w:r>
-        <w:rPr>
-          <w:spacing w:val="9"/>
-          <w:u w:val="none"/>
-        </w:rPr>
-        <w:t xml:space="preserve"> </w:t>
-      </w:r>
-      <w:r>
-        <w:rPr>
-          <w:u w:val="none"/>
-        </w:rPr>
-        <w:t>Management</w:t>
-      </w:r>
-      <w:r>
-        <w:rPr>
-          <w:spacing w:val="9"/>
-          <w:u w:val="none"/>
-        </w:rPr>
-        <w:t xml:space="preserve"> </w:t>
-      </w:r>
-      <w:r>
-        <w:rPr>
-          <w:spacing w:val="-2"/>
-          <w:u w:val="none"/>
-        </w:rPr>
-        <w:t>School</w:t>
-      </w:r>
-    </w:p>
-    <w:p>
-      <w:pPr>
-        <w:pStyle w:val="Balk5"/>
-        <w:spacing w:before="71" w:line="276" w:lineRule="auto"/>
-        <w:ind w:left="142" w:right="373"/>
-      </w:pPr>
-      <w:r>
-        <w:t>Bordeaux,</w:t>
-      </w:r>
-      <w:r>
-        <w:rPr>
-          <w:spacing w:val="-10"/>
-        </w:rPr>
-        <w:t xml:space="preserve"> </w:t>
-      </w:r>
-      <w:r>
-        <w:t>France</w:t>
-      </w:r>
-      <w:r>
-        <w:rPr>
-          <w:spacing w:val="-10"/>
-        </w:rPr>
-        <w:t xml:space="preserve"> </w:t>
-      </w:r>
-      <w:r>
-        <w:t>—</w:t>
-      </w:r>
-      <w:r>
-        <w:rPr>
-          <w:spacing w:val="-10"/>
-        </w:rPr>
-        <w:t xml:space="preserve"> </w:t>
-      </w:r>
-      <w:r>
-        <w:t>2013</w:t>
-      </w:r>
-      <w:r>
-        <w:rPr>
-          <w:spacing w:val="-10"/>
-        </w:rPr>
-        <w:t xml:space="preserve"> </w:t>
-      </w:r>
-      <w:r>
-        <w:t>(5</w:t>
-      </w:r>
-      <w:r>
-        <w:rPr>
-          <w:spacing w:val="-10"/>
-        </w:rPr>
-        <w:t xml:space="preserve"> </w:t>
-      </w:r>
-      <w:r>
-        <w:t>months)</w:t>
-      </w:r>
-      <w:r>
-        <w:br/>
-      </w:r>
-      <w:r>
-        <w:t>Exchange Student</w:t>
-      </w:r>
-    </w:p>
-    <w:p>
-      <w:pPr>
-        <w:ind w:left="142"/>
-        <w:rPr>
-          <w:sz w:val="20"/>
-        </w:rPr>
-      </w:pPr>
-      <w:r>
-        <w:rPr>
-          <w:sz w:val="20"/>
-        </w:rPr>
-        <w:t>Business</w:t>
-      </w:r>
-      <w:r>
-        <w:rPr>
-          <w:spacing w:val="-3"/>
-          <w:sz w:val="20"/>
-        </w:rPr>
-        <w:t xml:space="preserve"> </w:t>
-      </w:r>
-      <w:r>
-        <w:rPr>
-          <w:sz w:val="20"/>
-        </w:rPr>
-        <w:t>&amp;</w:t>
-      </w:r>
-      <w:r>
-        <w:rPr>
-          <w:spacing w:val="-2"/>
-          <w:sz w:val="20"/>
-        </w:rPr>
-        <w:t xml:space="preserve"> </w:t>
-      </w:r>
-      <w:r>
-        <w:rPr>
-          <w:sz w:val="20"/>
-        </w:rPr>
-        <w:t>Marketing</w:t>
-      </w:r>
-      <w:r>
-        <w:rPr>
-          <w:spacing w:val="-3"/>
-          <w:sz w:val="20"/>
-        </w:rPr>
-        <w:t xml:space="preserve"> </w:t>
-      </w:r>
-      <w:r>
-        <w:rPr>
-          <w:spacing w:val="-2"/>
-          <w:sz w:val="20"/>
-        </w:rPr>
-        <w:t>courses</w:t>
-      </w:r>
-    </w:p>
-    <w:p>
-      <w:pPr>
-        <w:pStyle w:val="GvdeMetni"/>
-        <w:spacing w:before="61"/>
-        <w:ind w:left="142" w:right="699"/>
-      </w:pPr>
-      <w:r>
-        <w:rPr>
-          <w:color w:val="5E5E5E"/>
-        </w:rPr>
-        <w:t>Main</w:t>
-      </w:r>
-      <w:r>
-        <w:rPr>
-          <w:color w:val="5E5E5E"/>
-          <w:spacing w:val="-6"/>
-        </w:rPr>
-        <w:t xml:space="preserve"> </w:t>
-      </w:r>
-      <w:r>
-        <w:rPr>
-          <w:color w:val="5E5E5E"/>
-        </w:rPr>
-        <w:t>Topics:</w:t>
-      </w:r>
-      <w:r>
-        <w:rPr>
-          <w:color w:val="5E5E5E"/>
-          <w:spacing w:val="-6"/>
-        </w:rPr>
-        <w:t xml:space="preserve"> </w:t>
-      </w:r>
-      <w:r>
-        <w:rPr>
-          <w:color w:val="5E5E5E"/>
-        </w:rPr>
-        <w:t>International</w:t>
-      </w:r>
-      <w:r>
-        <w:rPr>
-          <w:color w:val="5E5E5E"/>
-          <w:spacing w:val="-6"/>
-        </w:rPr>
-        <w:t xml:space="preserve"> </w:t>
-      </w:r>
-      <w:r>
-        <w:rPr>
-          <w:color w:val="5E5E5E"/>
-        </w:rPr>
-        <w:t>Project</w:t>
-      </w:r>
-      <w:r>
-        <w:rPr>
-          <w:color w:val="5E5E5E"/>
-          <w:spacing w:val="-6"/>
-        </w:rPr>
-        <w:t xml:space="preserve"> </w:t>
-      </w:r>
-      <w:r>
-        <w:rPr>
-          <w:color w:val="5E5E5E"/>
-        </w:rPr>
-        <w:t>Development, Human Resources, Marketing</w:t>
-      </w:r>
       <w:bookmarkEnd w:id="0"/>
     </w:p>
     <w:sectPr>
@@ -3006,7 +3647,7 @@
       <mc:AlternateContent>
         <mc:Choice Requires="wps">
           <w:drawing>
-            <wp:anchor distT="0" distB="0" distL="0" distR="0" simplePos="0" relativeHeight="251655680" behindDoc="1" locked="0" layoutInCell="1" allowOverlap="1" wp14:anchorId="1D50CB91" wp14:editId="08F308D4">
+            <wp:anchor distT="0" distB="0" distL="0" distR="0" simplePos="0" relativeHeight="251656704" behindDoc="1" locked="0" layoutInCell="1" allowOverlap="1" wp14:anchorId="1D50CB91" wp14:editId="08F308D4">
               <wp:simplePos x="0" y="0"/>
               <wp:positionH relativeFrom="page">
                 <wp:posOffset>3612997</wp:posOffset>
@@ -3149,7 +3790,7 @@
               <v:stroke joinstyle="miter"/>
               <v:path gradientshapeok="t" o:connecttype="rect"/>
             </v:shapetype>
-            <v:shape id="Textbox 1" o:spid="_x0000_s1026" type="#_x0000_t202" style="position:absolute;margin-left:284.5pt;margin-top:789.05pt;width:24.35pt;height:11.35pt;z-index:-251660800;visibility:visible;mso-wrap-style:square;mso-wrap-distance-left:0;mso-wrap-distance-top:0;mso-wrap-distance-right:0;mso-wrap-distance-bottom:0;mso-position-horizontal:absolute;mso-position-horizontal-relative:page;mso-position-vertical:absolute;mso-position-vertical-relative:page;v-text-anchor:top" o:gfxdata="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" filled="f" stroked="f">
+            <v:shape id="Textbox 1" o:spid="_x0000_s1026" type="#_x0000_t202" style="position:absolute;margin-left:284.5pt;margin-top:789.05pt;width:24.35pt;height:11.35pt;z-index:-251659776;visibility:visible;mso-wrap-style:square;mso-wrap-distance-left:0;mso-wrap-distance-top:0;mso-wrap-distance-right:0;mso-wrap-distance-bottom:0;mso-position-horizontal:absolute;mso-position-horizontal-relative:page;mso-position-vertical:absolute;mso-position-vertical-relative:page;v-text-anchor:top" o:gfxdata="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" filled="f" stroked="f">
               <v:textbox inset="0,0,0,0">
                 <w:txbxContent>
                   <w:p>
@@ -3283,7 +3924,7 @@
     <mc:AlternateContent>
       <mc:Choice Requires="v">
         <w:pict>
-          <v:shapetype w14:anchorId="3AB5554E" id="_x0000_t75" coordsize="21600,21600" o:spt="75" o:preferrelative="t" path="m@4@5l@4@11@9@11@9@5xe" filled="f" stroked="f">
+          <v:shapetype w14:anchorId="7C600E04" id="_x0000_t75" coordsize="21600,21600" o:spt="75" o:preferrelative="t" path="m@4@5l@4@11@9@11@9@5xe" filled="f" stroked="f">
             <v:stroke joinstyle="miter"/>
             <v:formulas>
               <v:f eqn="if lineDrawn pixelLineWidth 0"/>
@@ -3310,10 +3951,10 @@
       </mc:Choice>
       <mc:Fallback>
         <w:drawing>
-          <wp:inline distT="0" distB="0" distL="0" distR="0" wp14:anchorId="417537F6" wp14:editId="48F0B9EC">
+          <wp:inline distT="0" distB="0" distL="0" distR="0" wp14:anchorId="138EAE4D" wp14:editId="63C186EE">
             <wp:extent cx="300000" cy="157758"/>
             <wp:effectExtent l="0" t="0" r="0" b="0"/>
-            <wp:docPr id="175173742" name="Image 12"/>
+            <wp:docPr id="1692321640" name="Image 12"/>
             <wp:cNvGraphicFramePr>
               <a:graphicFrameLocks xmlns:a="http://schemas.openxmlformats.org/drawingml/2006/main"/>
             </wp:cNvGraphicFramePr>
@@ -5214,7 +5855,6 @@
   <w:style w:type="character" w:default="1" w:styleId="VarsaylanParagrafYazTipi">
     <w:name w:val="Default Paragraph Font"/>
     <w:uiPriority w:val="1"/>
-    <w:semiHidden/>
     <w:unhideWhenUsed/>
   </w:style>
   <w:style w:type="table" w:default="1" w:styleId="NormalTablo">

</xml_diff>